<commit_message>
fix: revisa documentação do projeto NRZ-L
</commit_message>
<xml_diff>
--- a/nrz_l/docs/documentacao_projeto.docx
+++ b/nrz_l/docs/documentacao_projeto.docx
@@ -371,25 +371,7 @@
         <w:rPr>
           <w:rFonts w:ascii="Arial" w:hAnsi="Arial" w:cs="Arial"/>
         </w:rPr>
-        <w:t xml:space="preserve"> transformar um conjunto de dados digitais em um sinal que possa ser transmitido de forma adequada, na forma de sinais elétricos por um meio de transmissão. </w:t>
-      </w:r>
-      <w:r>
-        <w:rPr>
-          <w:rFonts w:ascii="Arial" w:hAnsi="Arial" w:cs="Arial"/>
-        </w:rPr>
-        <w:t>De forma simples, os bits 0 são representados como nível baixo do sinal elétrico, enquanto</w:t>
-      </w:r>
-      <w:r>
-        <w:rPr>
-          <w:rFonts w:ascii="Arial" w:hAnsi="Arial" w:cs="Arial"/>
-        </w:rPr>
-        <w:t xml:space="preserve"> </w:t>
-      </w:r>
-      <w:r>
-        <w:rPr>
-          <w:rFonts w:ascii="Arial" w:hAnsi="Arial" w:cs="Arial"/>
-        </w:rPr>
-        <w:t>os bits 1 são representados como nível alto.</w:t>
+        <w:t xml:space="preserve"> transformar um conjunto de dados digitais em um sinal que possa ser transmitido de forma adequada, na forma de sinais elétricos por um meio de transmissão. De forma simples, os bits 0 são representados como nível baixo do sinal elétrico, enquanto os bits 1 são representados como nível alto.</w:t>
       </w:r>
     </w:p>
     <w:p>
@@ -434,27 +416,7 @@
           <w:sz w:val="28"/>
           <w:szCs w:val="28"/>
         </w:rPr>
-        <w:t>2</w:t>
-      </w:r>
-      <w:r>
-        <w:rPr>
-          <w:rFonts w:ascii="Arial" w:hAnsi="Arial" w:cs="Arial"/>
-          <w:b/>
-          <w:bCs/>
-          <w:sz w:val="28"/>
-          <w:szCs w:val="28"/>
-        </w:rPr>
-        <w:t xml:space="preserve">) </w:t>
-      </w:r>
-      <w:r>
-        <w:rPr>
-          <w:rFonts w:ascii="Arial" w:hAnsi="Arial" w:cs="Arial"/>
-          <w:b/>
-          <w:bCs/>
-          <w:sz w:val="28"/>
-          <w:szCs w:val="28"/>
-        </w:rPr>
-        <w:t>DIAGRAMA DE BLOCOS</w:t>
+        <w:t>2) DIAGRAMA DE BLOCOS</w:t>
       </w:r>
     </w:p>
     <w:p>
@@ -468,17 +430,20 @@
         <w:rPr>
           <w:rFonts w:ascii="Arial" w:hAnsi="Arial" w:cs="Arial"/>
         </w:rPr>
-        <w:t>De forma simplificada, o diagrama de blocos abaixa representa o esquema geral do circuito no papel de representar uma modulação NRZ-L:</w:t>
-      </w:r>
-    </w:p>
-    <w:p>
-      <w:pPr>
-        <w:ind w:firstLine="567"/>
-        <w:jc w:val="both"/>
-        <w:rPr>
-          <w:rFonts w:ascii="Arial" w:hAnsi="Arial" w:cs="Arial"/>
-        </w:rPr>
-      </w:pPr>
+        <w:t>De forma simplificada, o diagrama de blocos abaix</w:t>
+      </w:r>
+      <w:r>
+        <w:rPr>
+          <w:rFonts w:ascii="Arial" w:hAnsi="Arial" w:cs="Arial"/>
+        </w:rPr>
+        <w:t>o</w:t>
+      </w:r>
+      <w:r>
+        <w:rPr>
+          <w:rFonts w:ascii="Arial" w:hAnsi="Arial" w:cs="Arial"/>
+        </w:rPr>
+        <w:t xml:space="preserve"> representa o esquema geral do circuito:</w:t>
+      </w:r>
     </w:p>
     <w:p>
       <w:pPr>
@@ -489,6 +454,7 @@
       <w:r>
         <w:rPr>
           <w:rFonts w:ascii="Arial" w:hAnsi="Arial" w:cs="Arial"/>
+          <w:noProof/>
         </w:rPr>
         <w:drawing>
           <wp:inline distT="0" distB="0" distL="0" distR="0" wp14:anchorId="2ADC4BBF" wp14:editId="02906010">
@@ -535,26 +501,46 @@
       <w:r>
         <w:t xml:space="preserve">Figura </w:t>
       </w:r>
-      <w:r>
-        <w:fldChar w:fldCharType="begin"/>
-      </w:r>
-      <w:r>
-        <w:instrText xml:space="preserve"> SEQ Figura \* ARABIC </w:instrText>
-      </w:r>
-      <w:r>
-        <w:fldChar w:fldCharType="separate"/>
-      </w:r>
-      <w:r>
-        <w:rPr>
-          <w:noProof/>
-        </w:rPr>
-        <w:t>1</w:t>
-      </w:r>
-      <w:r>
-        <w:fldChar w:fldCharType="end"/>
-      </w:r>
+      <w:fldSimple w:instr=" SEQ Figura \* ARABIC ">
+        <w:r>
+          <w:rPr>
+            <w:noProof/>
+          </w:rPr>
+          <w:t>1</w:t>
+        </w:r>
+      </w:fldSimple>
       <w:r>
         <w:t xml:space="preserve"> - Diagrama de blocos Módulo NRZ-L</w:t>
+      </w:r>
+    </w:p>
+    <w:p/>
+    <w:p>
+      <w:pPr>
+        <w:ind w:firstLine="567"/>
+        <w:jc w:val="both"/>
+        <w:rPr>
+          <w:rFonts w:ascii="Arial" w:hAnsi="Arial" w:cs="Arial"/>
+        </w:rPr>
+      </w:pPr>
+      <w:r>
+        <w:rPr>
+          <w:rFonts w:ascii="Arial" w:hAnsi="Arial" w:cs="Arial"/>
+        </w:rPr>
+        <w:t xml:space="preserve">Conforme visto acima, o circuito possui por entradas as portas do </w:t>
+      </w:r>
+      <w:proofErr w:type="spellStart"/>
+      <w:r>
+        <w:rPr>
+          <w:rFonts w:ascii="Arial" w:hAnsi="Arial" w:cs="Arial"/>
+        </w:rPr>
+        <w:t>clock</w:t>
+      </w:r>
+      <w:proofErr w:type="spellEnd"/>
+      <w:r>
+        <w:rPr>
+          <w:rFonts w:ascii="Arial" w:hAnsi="Arial" w:cs="Arial"/>
+        </w:rPr>
+        <w:t xml:space="preserve"> e um vetor de dados (16 bits). Cada bit deste vetor é um switch diferente na placa.</w:t>
       </w:r>
     </w:p>
     <w:p>
@@ -569,7 +555,21 @@
         <w:rPr>
           <w:rFonts w:ascii="Arial" w:hAnsi="Arial" w:cs="Arial"/>
         </w:rPr>
-        <w:t>Conforme visto acima, o circuito possui por entradas as portas do clock e um vetor de dados (16 bits). Cada bit deste vetor é um switch diferente na placa.</w:t>
+        <w:t xml:space="preserve">Além disso, existem as variáveis globais definidas na área de Genéricos. Neste caso, NUM_BITS e CICLOS_POR_BIT, que definem com quantos bits o circuito trabalha e a quantidade de ciclos de </w:t>
+      </w:r>
+      <w:proofErr w:type="spellStart"/>
+      <w:r>
+        <w:rPr>
+          <w:rFonts w:ascii="Arial" w:hAnsi="Arial" w:cs="Arial"/>
+        </w:rPr>
+        <w:t>clock</w:t>
+      </w:r>
+      <w:proofErr w:type="spellEnd"/>
+      <w:r>
+        <w:rPr>
+          <w:rFonts w:ascii="Arial" w:hAnsi="Arial" w:cs="Arial"/>
+        </w:rPr>
+        <w:t xml:space="preserve"> que cada um deles terá, respectivamente.</w:t>
       </w:r>
     </w:p>
     <w:p>
@@ -584,29 +584,40 @@
         <w:rPr>
           <w:rFonts w:ascii="Arial" w:hAnsi="Arial" w:cs="Arial"/>
         </w:rPr>
-        <w:t>Além disso, existem as variáveis globais definidas na área de Genéricos. Neste caso, NUM_BITS e CICLOS_POR_BIT, que definem com quantos bits o circuito trabalha e a quantidade de ciclos de clock que cada um deles terá, respectivamente.</w:t>
-      </w:r>
-    </w:p>
-    <w:p>
-      <w:pPr>
-        <w:ind w:firstLine="567"/>
-        <w:jc w:val="both"/>
-        <w:rPr>
-          <w:rFonts w:ascii="Arial" w:hAnsi="Arial" w:cs="Arial"/>
-        </w:rPr>
-      </w:pPr>
-      <w:r>
-        <w:rPr>
-          <w:rFonts w:ascii="Arial" w:hAnsi="Arial" w:cs="Arial"/>
-        </w:rPr>
-        <w:t xml:space="preserve">Todas essas informações são utilizadas pelo processo principal que opera apenas quando o sinal de clock está na borda de subida. A cada ciclo de </w:t>
+        <w:t xml:space="preserve">Todas essas informações são utilizadas pelo processo principal que opera apenas quando o sinal de </w:t>
+      </w:r>
+      <w:proofErr w:type="spellStart"/>
+      <w:r>
+        <w:rPr>
+          <w:rFonts w:ascii="Arial" w:hAnsi="Arial" w:cs="Arial"/>
+        </w:rPr>
+        <w:t>clock</w:t>
+      </w:r>
+      <w:proofErr w:type="spellEnd"/>
+      <w:r>
+        <w:rPr>
+          <w:rFonts w:ascii="Arial" w:hAnsi="Arial" w:cs="Arial"/>
+        </w:rPr>
+        <w:t xml:space="preserve"> está na borda de subida. A cada ciclo de </w:t>
       </w:r>
       <w:r>
         <w:rPr>
           <w:rFonts w:ascii="Arial" w:hAnsi="Arial" w:cs="Arial"/>
         </w:rPr>
         <w:lastRenderedPageBreak/>
-        <w:t>processamento, a saída de LEDs é atualizada, acendendo ou apagando as luzes dependendo do estado atual da configuração de switches.</w:t>
+        <w:t>processamento, a saída de LEDs é atualizada, acendendo ou apagando as luzes</w:t>
+      </w:r>
+      <w:r>
+        <w:rPr>
+          <w:rFonts w:ascii="Arial" w:hAnsi="Arial" w:cs="Arial"/>
+        </w:rPr>
+        <w:t>,</w:t>
+      </w:r>
+      <w:r>
+        <w:rPr>
+          <w:rFonts w:ascii="Arial" w:hAnsi="Arial" w:cs="Arial"/>
+        </w:rPr>
+        <w:t xml:space="preserve"> dependendo do estado atual da configuração de switches.</w:t>
       </w:r>
     </w:p>
     <w:p>
@@ -646,17 +657,7 @@
           <w:sz w:val="28"/>
           <w:szCs w:val="28"/>
         </w:rPr>
-        <w:t xml:space="preserve">) </w:t>
-      </w:r>
-      <w:r>
-        <w:rPr>
-          <w:rFonts w:ascii="Arial" w:hAnsi="Arial" w:cs="Arial"/>
-          <w:b/>
-          <w:bCs/>
-          <w:sz w:val="28"/>
-          <w:szCs w:val="28"/>
-        </w:rPr>
-        <w:t>INTERFACE (ENTRADAS E SAÍDAS)</w:t>
+        <w:t>) INTERFACE (ENTRADAS E SAÍDAS)</w:t>
       </w:r>
     </w:p>
     <w:p>
@@ -786,6 +787,7 @@
                 <w:szCs w:val="20"/>
               </w:rPr>
             </w:pPr>
+            <w:proofErr w:type="spellStart"/>
             <w:r>
               <w:rPr>
                 <w:rFonts w:ascii="Arial" w:hAnsi="Arial" w:cs="Arial"/>
@@ -794,6 +796,7 @@
               </w:rPr>
               <w:t>clock</w:t>
             </w:r>
+            <w:proofErr w:type="spellEnd"/>
           </w:p>
         </w:tc>
         <w:tc>
@@ -810,6 +813,7 @@
                 <w:szCs w:val="20"/>
               </w:rPr>
             </w:pPr>
+            <w:proofErr w:type="spellStart"/>
             <w:r>
               <w:rPr>
                 <w:rFonts w:ascii="Arial" w:hAnsi="Arial" w:cs="Arial"/>
@@ -818,6 +822,7 @@
               </w:rPr>
               <w:t>std_logic</w:t>
             </w:r>
+            <w:proofErr w:type="spellEnd"/>
           </w:p>
         </w:tc>
         <w:tc>
@@ -840,8 +845,18 @@
                 <w:sz w:val="20"/>
                 <w:szCs w:val="20"/>
               </w:rPr>
-              <w:t>Definir o sinal de clock</w:t>
-            </w:r>
+              <w:t xml:space="preserve">Definir o sinal de </w:t>
+            </w:r>
+            <w:proofErr w:type="spellStart"/>
+            <w:r>
+              <w:rPr>
+                <w:rFonts w:ascii="Arial" w:hAnsi="Arial" w:cs="Arial"/>
+                <w:sz w:val="20"/>
+                <w:szCs w:val="20"/>
+              </w:rPr>
+              <w:t>clock</w:t>
+            </w:r>
+            <w:proofErr w:type="spellEnd"/>
           </w:p>
         </w:tc>
       </w:tr>
@@ -884,36 +899,82 @@
                 <w:szCs w:val="20"/>
               </w:rPr>
             </w:pPr>
+            <w:proofErr w:type="spellStart"/>
             <w:r>
               <w:rPr>
                 <w:rFonts w:ascii="Arial" w:hAnsi="Arial" w:cs="Arial"/>
                 <w:sz w:val="20"/>
                 <w:szCs w:val="20"/>
               </w:rPr>
-              <w:t>std_logic_vector(0 to 15)</w:t>
-            </w:r>
-          </w:p>
-        </w:tc>
-        <w:tc>
-          <w:tcPr>
-            <w:tcW w:w="2832" w:type="dxa"/>
-            <w:vAlign w:val="center"/>
-          </w:tcPr>
-          <w:p>
-            <w:pPr>
-              <w:jc w:val="center"/>
+              <w:t>std_logic_</w:t>
+            </w:r>
+            <w:proofErr w:type="gramStart"/>
+            <w:r>
               <w:rPr>
                 <w:rFonts w:ascii="Arial" w:hAnsi="Arial" w:cs="Arial"/>
                 <w:sz w:val="20"/>
                 <w:szCs w:val="20"/>
               </w:rPr>
-            </w:pPr>
+              <w:t>vector</w:t>
+            </w:r>
+            <w:proofErr w:type="spellEnd"/>
             <w:r>
               <w:rPr>
                 <w:rFonts w:ascii="Arial" w:hAnsi="Arial" w:cs="Arial"/>
                 <w:sz w:val="20"/>
                 <w:szCs w:val="20"/>
               </w:rPr>
+              <w:t>(</w:t>
+            </w:r>
+            <w:proofErr w:type="gramEnd"/>
+            <w:r>
+              <w:rPr>
+                <w:rFonts w:ascii="Arial" w:hAnsi="Arial" w:cs="Arial"/>
+                <w:sz w:val="20"/>
+                <w:szCs w:val="20"/>
+              </w:rPr>
+              <w:t xml:space="preserve">0 </w:t>
+            </w:r>
+            <w:proofErr w:type="spellStart"/>
+            <w:r>
+              <w:rPr>
+                <w:rFonts w:ascii="Arial" w:hAnsi="Arial" w:cs="Arial"/>
+                <w:sz w:val="20"/>
+                <w:szCs w:val="20"/>
+              </w:rPr>
+              <w:t>to</w:t>
+            </w:r>
+            <w:proofErr w:type="spellEnd"/>
+            <w:r>
+              <w:rPr>
+                <w:rFonts w:ascii="Arial" w:hAnsi="Arial" w:cs="Arial"/>
+                <w:sz w:val="20"/>
+                <w:szCs w:val="20"/>
+              </w:rPr>
+              <w:t xml:space="preserve"> 15)</w:t>
+            </w:r>
+          </w:p>
+        </w:tc>
+        <w:tc>
+          <w:tcPr>
+            <w:tcW w:w="2832" w:type="dxa"/>
+            <w:vAlign w:val="center"/>
+          </w:tcPr>
+          <w:p>
+            <w:pPr>
+              <w:jc w:val="center"/>
+              <w:rPr>
+                <w:rFonts w:ascii="Arial" w:hAnsi="Arial" w:cs="Arial"/>
+                <w:sz w:val="20"/>
+                <w:szCs w:val="20"/>
+              </w:rPr>
+            </w:pPr>
+            <w:r>
+              <w:rPr>
+                <w:rFonts w:ascii="Arial" w:hAnsi="Arial" w:cs="Arial"/>
+                <w:sz w:val="20"/>
+                <w:szCs w:val="20"/>
+              </w:rPr>
               <w:t>Sequência de bits (Switches)</w:t>
             </w:r>
           </w:p>
@@ -934,6 +995,7 @@
                 <w:szCs w:val="20"/>
               </w:rPr>
             </w:pPr>
+            <w:proofErr w:type="spellStart"/>
             <w:r>
               <w:rPr>
                 <w:rFonts w:ascii="Arial" w:hAnsi="Arial" w:cs="Arial"/>
@@ -942,6 +1004,7 @@
               </w:rPr>
               <w:t>saida_leds</w:t>
             </w:r>
+            <w:proofErr w:type="spellEnd"/>
           </w:p>
         </w:tc>
         <w:tc>
@@ -958,13 +1021,59 @@
                 <w:szCs w:val="20"/>
               </w:rPr>
             </w:pPr>
+            <w:proofErr w:type="spellStart"/>
             <w:r>
               <w:rPr>
                 <w:rFonts w:ascii="Arial" w:hAnsi="Arial" w:cs="Arial"/>
                 <w:sz w:val="20"/>
                 <w:szCs w:val="20"/>
               </w:rPr>
-              <w:t>std_logic_vector(0 to 15)</w:t>
+              <w:t>std_logic_</w:t>
+            </w:r>
+            <w:proofErr w:type="gramStart"/>
+            <w:r>
+              <w:rPr>
+                <w:rFonts w:ascii="Arial" w:hAnsi="Arial" w:cs="Arial"/>
+                <w:sz w:val="20"/>
+                <w:szCs w:val="20"/>
+              </w:rPr>
+              <w:t>vector</w:t>
+            </w:r>
+            <w:proofErr w:type="spellEnd"/>
+            <w:r>
+              <w:rPr>
+                <w:rFonts w:ascii="Arial" w:hAnsi="Arial" w:cs="Arial"/>
+                <w:sz w:val="20"/>
+                <w:szCs w:val="20"/>
+              </w:rPr>
+              <w:t>(</w:t>
+            </w:r>
+            <w:proofErr w:type="gramEnd"/>
+            <w:r>
+              <w:rPr>
+                <w:rFonts w:ascii="Arial" w:hAnsi="Arial" w:cs="Arial"/>
+                <w:sz w:val="20"/>
+                <w:szCs w:val="20"/>
+              </w:rPr>
+              <w:t xml:space="preserve">0 </w:t>
+            </w:r>
+            <w:proofErr w:type="spellStart"/>
+            <w:r>
+              <w:rPr>
+                <w:rFonts w:ascii="Arial" w:hAnsi="Arial" w:cs="Arial"/>
+                <w:sz w:val="20"/>
+                <w:szCs w:val="20"/>
+              </w:rPr>
+              <w:t>to</w:t>
+            </w:r>
+            <w:proofErr w:type="spellEnd"/>
+            <w:r>
+              <w:rPr>
+                <w:rFonts w:ascii="Arial" w:hAnsi="Arial" w:cs="Arial"/>
+                <w:sz w:val="20"/>
+                <w:szCs w:val="20"/>
+              </w:rPr>
+              <w:t xml:space="preserve"> 15)</w:t>
             </w:r>
           </w:p>
         </w:tc>
@@ -975,6 +1084,7 @@
           </w:tcPr>
           <w:p>
             <w:pPr>
+              <w:keepNext/>
               <w:jc w:val="center"/>
               <w:rPr>
                 <w:rFonts w:ascii="Arial" w:hAnsi="Arial" w:cs="Arial"/>
@@ -996,13 +1106,25 @@
     </w:tbl>
     <w:p>
       <w:pPr>
-        <w:ind w:firstLine="567"/>
-        <w:jc w:val="both"/>
-        <w:rPr>
-          <w:rFonts w:ascii="Arial" w:hAnsi="Arial" w:cs="Arial"/>
-        </w:rPr>
-      </w:pPr>
+        <w:pStyle w:val="Legenda"/>
+        <w:jc w:val="center"/>
+      </w:pPr>
+      <w:r>
+        <w:t xml:space="preserve">Tabela </w:t>
+      </w:r>
+      <w:fldSimple w:instr=" SEQ Tabela \* ARABIC ">
+        <w:r>
+          <w:rPr>
+            <w:noProof/>
+          </w:rPr>
+          <w:t>1</w:t>
+        </w:r>
+      </w:fldSimple>
+      <w:r>
+        <w:t xml:space="preserve"> - Interface do circuito modulador</w:t>
+      </w:r>
     </w:p>
+    <w:p/>
     <w:p>
       <w:pPr>
         <w:rPr>
@@ -1021,27 +1143,7 @@
           <w:sz w:val="28"/>
           <w:szCs w:val="28"/>
         </w:rPr>
-        <w:t>4</w:t>
-      </w:r>
-      <w:r>
-        <w:rPr>
-          <w:rFonts w:ascii="Arial" w:hAnsi="Arial" w:cs="Arial"/>
-          <w:b/>
-          <w:bCs/>
-          <w:sz w:val="28"/>
-          <w:szCs w:val="28"/>
-        </w:rPr>
-        <w:t xml:space="preserve">) </w:t>
-      </w:r>
-      <w:r>
-        <w:rPr>
-          <w:rFonts w:ascii="Arial" w:hAnsi="Arial" w:cs="Arial"/>
-          <w:b/>
-          <w:bCs/>
-          <w:sz w:val="28"/>
-          <w:szCs w:val="28"/>
-        </w:rPr>
-        <w:t>PARÂMETROS (GENERICS)</w:t>
+        <w:t>4) PARÂMETROS (GENERICS)</w:t>
       </w:r>
     </w:p>
     <w:p>
@@ -1056,7 +1158,21 @@
         <w:rPr>
           <w:rFonts w:ascii="Arial" w:hAnsi="Arial" w:cs="Arial"/>
         </w:rPr>
-        <w:t>Na programação VHDL do circuito modulador, foram definidas as seguintes Generics:</w:t>
+        <w:t xml:space="preserve">Na programação VHDL do circuito modulador, foram definidas as seguintes </w:t>
+      </w:r>
+      <w:proofErr w:type="spellStart"/>
+      <w:r>
+        <w:rPr>
+          <w:rFonts w:ascii="Arial" w:hAnsi="Arial" w:cs="Arial"/>
+        </w:rPr>
+        <w:t>Generics</w:t>
+      </w:r>
+      <w:proofErr w:type="spellEnd"/>
+      <w:r>
+        <w:rPr>
+          <w:rFonts w:ascii="Arial" w:hAnsi="Arial" w:cs="Arial"/>
+        </w:rPr>
+        <w:t>:</w:t>
       </w:r>
     </w:p>
     <w:tbl>
@@ -1198,37 +1314,63 @@
                 <w:szCs w:val="20"/>
               </w:rPr>
             </w:pPr>
+            <w:proofErr w:type="spellStart"/>
             <w:r>
               <w:rPr>
                 <w:rFonts w:ascii="Arial" w:hAnsi="Arial" w:cs="Arial"/>
                 <w:sz w:val="20"/>
                 <w:szCs w:val="20"/>
               </w:rPr>
-              <w:t>integer</w:t>
-            </w:r>
-          </w:p>
-        </w:tc>
-        <w:tc>
-          <w:tcPr>
-            <w:tcW w:w="2832" w:type="dxa"/>
-            <w:vAlign w:val="center"/>
-          </w:tcPr>
-          <w:p>
-            <w:pPr>
-              <w:jc w:val="center"/>
+              <w:t>I</w:t>
+            </w:r>
+            <w:r>
               <w:rPr>
                 <w:rFonts w:ascii="Arial" w:hAnsi="Arial" w:cs="Arial"/>
                 <w:sz w:val="20"/>
                 <w:szCs w:val="20"/>
               </w:rPr>
-            </w:pPr>
-            <w:r>
+              <w:t>nteger</w:t>
+            </w:r>
+            <w:proofErr w:type="spellEnd"/>
+          </w:p>
+        </w:tc>
+        <w:tc>
+          <w:tcPr>
+            <w:tcW w:w="2832" w:type="dxa"/>
+            <w:vAlign w:val="center"/>
+          </w:tcPr>
+          <w:p>
+            <w:pPr>
+              <w:jc w:val="center"/>
               <w:rPr>
                 <w:rFonts w:ascii="Arial" w:hAnsi="Arial" w:cs="Arial"/>
                 <w:sz w:val="20"/>
                 <w:szCs w:val="20"/>
               </w:rPr>
-              <w:t>Determina a quantidade de BITS com a qual o circuito trabalha.</w:t>
+            </w:pPr>
+            <w:r>
+              <w:rPr>
+                <w:rFonts w:ascii="Arial" w:hAnsi="Arial" w:cs="Arial"/>
+                <w:sz w:val="20"/>
+                <w:szCs w:val="20"/>
+              </w:rPr>
+              <w:t xml:space="preserve">Determina a quantidade de </w:t>
+            </w:r>
+            <w:r>
+              <w:rPr>
+                <w:rFonts w:ascii="Arial" w:hAnsi="Arial" w:cs="Arial"/>
+                <w:sz w:val="20"/>
+                <w:szCs w:val="20"/>
+              </w:rPr>
+              <w:t>bits</w:t>
+            </w:r>
+            <w:r>
+              <w:rPr>
+                <w:rFonts w:ascii="Arial" w:hAnsi="Arial" w:cs="Arial"/>
+                <w:sz w:val="20"/>
+                <w:szCs w:val="20"/>
+              </w:rPr>
+              <w:t xml:space="preserve"> com a qual o circuito trabalha.</w:t>
             </w:r>
           </w:p>
         </w:tc>
@@ -1275,37 +1417,66 @@
                 <w:szCs w:val="20"/>
               </w:rPr>
             </w:pPr>
+            <w:proofErr w:type="spellStart"/>
             <w:r>
               <w:rPr>
                 <w:rFonts w:ascii="Arial" w:hAnsi="Arial" w:cs="Arial"/>
                 <w:sz w:val="20"/>
                 <w:szCs w:val="20"/>
               </w:rPr>
-              <w:t>Integer</w:t>
-            </w:r>
-          </w:p>
-        </w:tc>
-        <w:tc>
-          <w:tcPr>
-            <w:tcW w:w="2832" w:type="dxa"/>
-            <w:vAlign w:val="center"/>
-          </w:tcPr>
-          <w:p>
-            <w:pPr>
-              <w:jc w:val="center"/>
+              <w:t>I</w:t>
+            </w:r>
+            <w:r>
               <w:rPr>
                 <w:rFonts w:ascii="Arial" w:hAnsi="Arial" w:cs="Arial"/>
                 <w:sz w:val="20"/>
                 <w:szCs w:val="20"/>
               </w:rPr>
-            </w:pPr>
-            <w:r>
+              <w:t>nteger</w:t>
+            </w:r>
+            <w:proofErr w:type="spellEnd"/>
+          </w:p>
+        </w:tc>
+        <w:tc>
+          <w:tcPr>
+            <w:tcW w:w="2832" w:type="dxa"/>
+            <w:vAlign w:val="center"/>
+          </w:tcPr>
+          <w:p>
+            <w:pPr>
+              <w:keepNext/>
+              <w:jc w:val="center"/>
               <w:rPr>
                 <w:rFonts w:ascii="Arial" w:hAnsi="Arial" w:cs="Arial"/>
                 <w:sz w:val="20"/>
                 <w:szCs w:val="20"/>
               </w:rPr>
-              <w:t>Determina a quantidade de ciclos de Clock utilizada para transmitir cada bit.</w:t>
+            </w:pPr>
+            <w:r>
+              <w:rPr>
+                <w:rFonts w:ascii="Arial" w:hAnsi="Arial" w:cs="Arial"/>
+                <w:sz w:val="20"/>
+                <w:szCs w:val="20"/>
+              </w:rPr>
+              <w:t xml:space="preserve">Determina a quantidade de ciclos de </w:t>
+            </w:r>
+            <w:proofErr w:type="spellStart"/>
+            <w:r>
+              <w:rPr>
+                <w:rFonts w:ascii="Arial" w:hAnsi="Arial" w:cs="Arial"/>
+                <w:sz w:val="20"/>
+                <w:szCs w:val="20"/>
+              </w:rPr>
+              <w:t>Clock</w:t>
+            </w:r>
+            <w:proofErr w:type="spellEnd"/>
+            <w:r>
+              <w:rPr>
+                <w:rFonts w:ascii="Arial" w:hAnsi="Arial" w:cs="Arial"/>
+                <w:sz w:val="20"/>
+                <w:szCs w:val="20"/>
+              </w:rPr>
+              <w:t xml:space="preserve"> utilizada para transmitir cada bit.</w:t>
             </w:r>
           </w:p>
         </w:tc>
@@ -1313,12 +1484,33 @@
     </w:tbl>
     <w:p>
       <w:pPr>
-        <w:jc w:val="both"/>
-        <w:rPr>
-          <w:rFonts w:ascii="Arial" w:hAnsi="Arial" w:cs="Arial"/>
-        </w:rPr>
-      </w:pPr>
+        <w:pStyle w:val="Legenda"/>
+        <w:jc w:val="center"/>
+      </w:pPr>
+      <w:r>
+        <w:t xml:space="preserve">Tabela </w:t>
+      </w:r>
+      <w:fldSimple w:instr=" SEQ Tabela \* ARABIC ">
+        <w:r>
+          <w:rPr>
+            <w:noProof/>
+          </w:rPr>
+          <w:t>2</w:t>
+        </w:r>
+      </w:fldSimple>
+      <w:r>
+        <w:t xml:space="preserve"> - </w:t>
+      </w:r>
+      <w:proofErr w:type="spellStart"/>
+      <w:r>
+        <w:t>Generics</w:t>
+      </w:r>
+      <w:proofErr w:type="spellEnd"/>
+      <w:r>
+        <w:t xml:space="preserve"> do circuito modulador</w:t>
+      </w:r>
     </w:p>
+    <w:p/>
     <w:p>
       <w:pPr>
         <w:rPr>
@@ -1337,9 +1529,304 @@
           <w:sz w:val="28"/>
           <w:szCs w:val="28"/>
         </w:rPr>
-        <w:t>5</w:t>
-      </w:r>
-      <w:r>
+        <w:t>5) FUNCIONAMENTO INTERNO</w:t>
+      </w:r>
+    </w:p>
+    <w:p>
+      <w:pPr>
+        <w:ind w:firstLine="567"/>
+        <w:rPr>
+          <w:rFonts w:ascii="Arial" w:hAnsi="Arial" w:cs="Arial"/>
+        </w:rPr>
+      </w:pPr>
+      <w:r>
+        <w:rPr>
+          <w:rFonts w:ascii="Arial" w:hAnsi="Arial" w:cs="Arial"/>
+        </w:rPr>
+        <w:t>Tendo em vista</w:t>
+      </w:r>
+      <w:r>
+        <w:rPr>
+          <w:rFonts w:ascii="Arial" w:hAnsi="Arial" w:cs="Arial"/>
+        </w:rPr>
+        <w:t xml:space="preserve"> o diagrama de blocos, portas e </w:t>
+      </w:r>
+      <w:proofErr w:type="spellStart"/>
+      <w:r>
+        <w:rPr>
+          <w:rFonts w:ascii="Arial" w:hAnsi="Arial" w:cs="Arial"/>
+        </w:rPr>
+        <w:t>gen</w:t>
+      </w:r>
+      <w:r>
+        <w:rPr>
+          <w:rFonts w:ascii="Arial" w:hAnsi="Arial" w:cs="Arial"/>
+        </w:rPr>
+        <w:t>e</w:t>
+      </w:r>
+      <w:r>
+        <w:rPr>
+          <w:rFonts w:ascii="Arial" w:hAnsi="Arial" w:cs="Arial"/>
+        </w:rPr>
+        <w:t>rics</w:t>
+      </w:r>
+      <w:proofErr w:type="spellEnd"/>
+      <w:r>
+        <w:rPr>
+          <w:rFonts w:ascii="Arial" w:hAnsi="Arial" w:cs="Arial"/>
+        </w:rPr>
+        <w:t xml:space="preserve"> especificados nos itens anteriores, o circuito do modulador funciona de acordo com a lógica </w:t>
+      </w:r>
+      <w:r>
+        <w:rPr>
+          <w:rFonts w:ascii="Arial" w:hAnsi="Arial" w:cs="Arial"/>
+        </w:rPr>
+        <w:t>detalhada</w:t>
+      </w:r>
+      <w:r>
+        <w:rPr>
+          <w:rFonts w:ascii="Arial" w:hAnsi="Arial" w:cs="Arial"/>
+        </w:rPr>
+        <w:t xml:space="preserve"> a seguir.</w:t>
+      </w:r>
+    </w:p>
+    <w:p>
+      <w:pPr>
+        <w:ind w:firstLine="567"/>
+        <w:rPr>
+          <w:rFonts w:ascii="Arial" w:hAnsi="Arial" w:cs="Arial"/>
+        </w:rPr>
+      </w:pPr>
+      <w:r>
+        <w:rPr>
+          <w:rFonts w:ascii="Arial" w:hAnsi="Arial" w:cs="Arial"/>
+        </w:rPr>
+        <w:t xml:space="preserve">A cada borda de subida do sinal de </w:t>
+      </w:r>
+      <w:proofErr w:type="spellStart"/>
+      <w:r>
+        <w:rPr>
+          <w:rFonts w:ascii="Arial" w:hAnsi="Arial" w:cs="Arial"/>
+        </w:rPr>
+        <w:t>clock</w:t>
+      </w:r>
+      <w:proofErr w:type="spellEnd"/>
+      <w:r>
+        <w:rPr>
+          <w:rFonts w:ascii="Arial" w:hAnsi="Arial" w:cs="Arial"/>
+        </w:rPr>
+        <w:t xml:space="preserve">, o sistema verifica o </w:t>
+      </w:r>
+      <w:r>
+        <w:rPr>
+          <w:rFonts w:ascii="Arial" w:hAnsi="Arial" w:cs="Arial"/>
+        </w:rPr>
+        <w:t xml:space="preserve">estado do </w:t>
+      </w:r>
+      <w:r>
+        <w:rPr>
+          <w:rFonts w:ascii="Arial" w:hAnsi="Arial" w:cs="Arial"/>
+        </w:rPr>
+        <w:t>bit atual a ser transmitido</w:t>
+      </w:r>
+      <w:r>
+        <w:rPr>
+          <w:rFonts w:ascii="Arial" w:hAnsi="Arial" w:cs="Arial"/>
+        </w:rPr>
+        <w:t xml:space="preserve">. Por meio da variável </w:t>
+      </w:r>
+      <w:proofErr w:type="spellStart"/>
+      <w:r>
+        <w:rPr>
+          <w:rFonts w:ascii="Arial" w:hAnsi="Arial" w:cs="Arial"/>
+        </w:rPr>
+        <w:t>bit_index</w:t>
+      </w:r>
+      <w:proofErr w:type="spellEnd"/>
+      <w:r>
+        <w:rPr>
+          <w:rFonts w:ascii="Arial" w:hAnsi="Arial" w:cs="Arial"/>
+        </w:rPr>
+        <w:t xml:space="preserve">, o sistema pega o valor do bit junto ao vetor de entrada, em sua respectiva posição. Em seguida, </w:t>
+      </w:r>
+      <w:r>
+        <w:rPr>
+          <w:rFonts w:ascii="Arial" w:hAnsi="Arial" w:cs="Arial"/>
+        </w:rPr>
+        <w:t>o valor do</w:t>
+      </w:r>
+      <w:r>
+        <w:rPr>
+          <w:rFonts w:ascii="Arial" w:hAnsi="Arial" w:cs="Arial"/>
+        </w:rPr>
+        <w:t xml:space="preserve"> bit </w:t>
+      </w:r>
+      <w:r>
+        <w:rPr>
+          <w:rFonts w:ascii="Arial" w:hAnsi="Arial" w:cs="Arial"/>
+        </w:rPr>
+        <w:t xml:space="preserve">é </w:t>
+      </w:r>
+      <w:r>
+        <w:rPr>
+          <w:rFonts w:ascii="Arial" w:hAnsi="Arial" w:cs="Arial"/>
+        </w:rPr>
+        <w:t xml:space="preserve">atualizado no vetor </w:t>
+      </w:r>
+      <w:proofErr w:type="spellStart"/>
+      <w:r>
+        <w:rPr>
+          <w:rFonts w:ascii="Arial" w:hAnsi="Arial" w:cs="Arial"/>
+        </w:rPr>
+        <w:t>saida_leds</w:t>
+      </w:r>
+      <w:proofErr w:type="spellEnd"/>
+      <w:r>
+        <w:rPr>
+          <w:rFonts w:ascii="Arial" w:hAnsi="Arial" w:cs="Arial"/>
+        </w:rPr>
+        <w:t xml:space="preserve">, também na posição indicada pelo </w:t>
+      </w:r>
+      <w:proofErr w:type="spellStart"/>
+      <w:r>
+        <w:rPr>
+          <w:rFonts w:ascii="Arial" w:hAnsi="Arial" w:cs="Arial"/>
+        </w:rPr>
+        <w:t>bit_index</w:t>
+      </w:r>
+      <w:proofErr w:type="spellEnd"/>
+      <w:r>
+        <w:rPr>
+          <w:rFonts w:ascii="Arial" w:hAnsi="Arial" w:cs="Arial"/>
+        </w:rPr>
+        <w:t>.</w:t>
+      </w:r>
+    </w:p>
+    <w:p>
+      <w:pPr>
+        <w:ind w:firstLine="567"/>
+        <w:rPr>
+          <w:rFonts w:ascii="Arial" w:hAnsi="Arial" w:cs="Arial"/>
+        </w:rPr>
+      </w:pPr>
+      <w:r>
+        <w:rPr>
+          <w:rFonts w:ascii="Arial" w:hAnsi="Arial" w:cs="Arial"/>
+        </w:rPr>
+        <w:t>A duração de cada bit é controlada pel</w:t>
+      </w:r>
+      <w:r>
+        <w:rPr>
+          <w:rFonts w:ascii="Arial" w:hAnsi="Arial" w:cs="Arial"/>
+        </w:rPr>
+        <w:t xml:space="preserve">a variável </w:t>
+      </w:r>
+      <w:proofErr w:type="spellStart"/>
+      <w:r>
+        <w:rPr>
+          <w:rFonts w:ascii="Arial" w:hAnsi="Arial" w:cs="Arial"/>
+        </w:rPr>
+        <w:t>contador_clock</w:t>
+      </w:r>
+      <w:proofErr w:type="spellEnd"/>
+      <w:r>
+        <w:rPr>
+          <w:rFonts w:ascii="Arial" w:hAnsi="Arial" w:cs="Arial"/>
+        </w:rPr>
+        <w:t xml:space="preserve">, que </w:t>
+      </w:r>
+      <w:r>
+        <w:rPr>
+          <w:rFonts w:ascii="Arial" w:hAnsi="Arial" w:cs="Arial"/>
+        </w:rPr>
+        <w:t>incrementa de 0 até o valor definido na variável CICLOS_POR_BIT</w:t>
+      </w:r>
+      <w:r>
+        <w:rPr>
+          <w:rFonts w:ascii="Arial" w:hAnsi="Arial" w:cs="Arial"/>
+        </w:rPr>
+        <w:t xml:space="preserve">. Após o término desse período, o contador é reiniciado e o próximo bit da sequência é </w:t>
+      </w:r>
+      <w:r>
+        <w:rPr>
+          <w:rFonts w:ascii="Arial" w:hAnsi="Arial" w:cs="Arial"/>
+        </w:rPr>
+        <w:t>processado</w:t>
+      </w:r>
+      <w:r>
+        <w:rPr>
+          <w:rFonts w:ascii="Arial" w:hAnsi="Arial" w:cs="Arial"/>
+        </w:rPr>
+        <w:t>.</w:t>
+      </w:r>
+    </w:p>
+    <w:p>
+      <w:pPr>
+        <w:ind w:firstLine="567"/>
+        <w:rPr>
+          <w:rFonts w:ascii="Arial" w:hAnsi="Arial" w:cs="Arial"/>
+        </w:rPr>
+      </w:pPr>
+      <w:r>
+        <w:rPr>
+          <w:rFonts w:ascii="Arial" w:hAnsi="Arial" w:cs="Arial"/>
+        </w:rPr>
+        <w:lastRenderedPageBreak/>
+        <w:t xml:space="preserve">Quando todos os bits </w:t>
+      </w:r>
+      <w:r>
+        <w:rPr>
+          <w:rFonts w:ascii="Arial" w:hAnsi="Arial" w:cs="Arial"/>
+        </w:rPr>
+        <w:t>da sequência de entrada são transmitidos (o vetor foi iterado de 0 até o valor definido em</w:t>
+      </w:r>
+      <w:r>
+        <w:rPr>
+          <w:rFonts w:ascii="Arial" w:hAnsi="Arial" w:cs="Arial"/>
+        </w:rPr>
+        <w:t xml:space="preserve"> NUM_BITS</w:t>
+      </w:r>
+      <w:r>
+        <w:rPr>
+          <w:rFonts w:ascii="Arial" w:hAnsi="Arial" w:cs="Arial"/>
+        </w:rPr>
+        <w:t>)</w:t>
+      </w:r>
+      <w:r>
+        <w:rPr>
+          <w:rFonts w:ascii="Arial" w:hAnsi="Arial" w:cs="Arial"/>
+        </w:rPr>
+        <w:t>, o circuito reinicia o processo,</w:t>
+      </w:r>
+      <w:r>
+        <w:rPr>
+          <w:rFonts w:ascii="Arial" w:hAnsi="Arial" w:cs="Arial"/>
+        </w:rPr>
+        <w:t xml:space="preserve"> </w:t>
+      </w:r>
+      <w:r>
+        <w:rPr>
+          <w:rFonts w:ascii="Arial" w:hAnsi="Arial" w:cs="Arial"/>
+        </w:rPr>
+        <w:t>abrindo</w:t>
+      </w:r>
+      <w:r>
+        <w:rPr>
+          <w:rFonts w:ascii="Arial" w:hAnsi="Arial" w:cs="Arial"/>
+        </w:rPr>
+        <w:t xml:space="preserve"> um novo ciclo de transmissão.</w:t>
+      </w:r>
+    </w:p>
+    <w:p>
+      <w:pPr>
+        <w:ind w:firstLine="567"/>
+        <w:rPr>
+          <w:rFonts w:ascii="Arial" w:hAnsi="Arial" w:cs="Arial"/>
+        </w:rPr>
+      </w:pPr>
+    </w:p>
+    <w:p>
+      <w:pPr>
         <w:rPr>
           <w:rFonts w:ascii="Arial" w:hAnsi="Arial" w:cs="Arial"/>
           <w:b/>
@@ -1347,8 +1834,7 @@
           <w:sz w:val="28"/>
           <w:szCs w:val="28"/>
         </w:rPr>
-        <w:t xml:space="preserve">) </w:t>
-      </w:r>
+      </w:pPr>
       <w:r>
         <w:rPr>
           <w:rFonts w:ascii="Arial" w:hAnsi="Arial" w:cs="Arial"/>
@@ -1357,185 +1843,9 @@
           <w:sz w:val="28"/>
           <w:szCs w:val="28"/>
         </w:rPr>
-        <w:t>FUNCIONAMENTO INTERNO</w:t>
-      </w:r>
-    </w:p>
-    <w:p>
-      <w:pPr>
-        <w:ind w:firstLine="567"/>
-        <w:rPr>
-          <w:rFonts w:ascii="Arial" w:hAnsi="Arial" w:cs="Arial"/>
-        </w:rPr>
-      </w:pPr>
-      <w:r>
-        <w:rPr>
-          <w:rFonts w:ascii="Arial" w:hAnsi="Arial" w:cs="Arial"/>
-        </w:rPr>
-        <w:t>Conforme o diagrama de blocos, portas e genérics especificados nos itens anteriores, o circuito do modulador funciona de acordo com a lógica especificada a seguir.</w:t>
-      </w:r>
-    </w:p>
-    <w:p>
-      <w:pPr>
-        <w:ind w:firstLine="567"/>
-        <w:rPr>
-          <w:rFonts w:ascii="Arial" w:hAnsi="Arial" w:cs="Arial"/>
-        </w:rPr>
-      </w:pPr>
-      <w:r>
-        <w:rPr>
-          <w:rFonts w:ascii="Arial" w:hAnsi="Arial" w:cs="Arial"/>
-        </w:rPr>
-        <w:t xml:space="preserve">A cada borda de subida do sinal de clock, o sistema verifica o </w:t>
-      </w:r>
-      <w:r>
-        <w:rPr>
-          <w:rFonts w:ascii="Arial" w:hAnsi="Arial" w:cs="Arial"/>
-        </w:rPr>
-        <w:t xml:space="preserve">estado do </w:t>
-      </w:r>
-      <w:r>
-        <w:rPr>
-          <w:rFonts w:ascii="Arial" w:hAnsi="Arial" w:cs="Arial"/>
-        </w:rPr>
-        <w:t>bit atual a ser transmitido</w:t>
-      </w:r>
-      <w:r>
-        <w:rPr>
-          <w:rFonts w:ascii="Arial" w:hAnsi="Arial" w:cs="Arial"/>
-        </w:rPr>
-        <w:t xml:space="preserve">. Por meio da variável bit_index, o sistema pega o valor do bit junto ao vetor de entrada, em sua respectiva posição. Em seguida, </w:t>
-      </w:r>
-      <w:r>
-        <w:rPr>
-          <w:rFonts w:ascii="Arial" w:hAnsi="Arial" w:cs="Arial"/>
-        </w:rPr>
-        <w:t>o valor do</w:t>
-      </w:r>
-      <w:r>
-        <w:rPr>
-          <w:rFonts w:ascii="Arial" w:hAnsi="Arial" w:cs="Arial"/>
-        </w:rPr>
-        <w:t xml:space="preserve"> bit </w:t>
-      </w:r>
-      <w:r>
-        <w:rPr>
-          <w:rFonts w:ascii="Arial" w:hAnsi="Arial" w:cs="Arial"/>
-        </w:rPr>
-        <w:t xml:space="preserve">é </w:t>
-      </w:r>
-      <w:r>
-        <w:rPr>
-          <w:rFonts w:ascii="Arial" w:hAnsi="Arial" w:cs="Arial"/>
-        </w:rPr>
-        <w:t>atualizado no vetor saida_leds, também na posição indicada pelo bit_index.</w:t>
-      </w:r>
-    </w:p>
-    <w:p>
-      <w:pPr>
-        <w:ind w:firstLine="567"/>
-        <w:rPr>
-          <w:rFonts w:ascii="Arial" w:hAnsi="Arial" w:cs="Arial"/>
-        </w:rPr>
-      </w:pPr>
-      <w:r>
-        <w:rPr>
-          <w:rFonts w:ascii="Arial" w:hAnsi="Arial" w:cs="Arial"/>
-        </w:rPr>
-        <w:t>A duração de cada bit é controlada pel</w:t>
-      </w:r>
-      <w:r>
-        <w:rPr>
-          <w:rFonts w:ascii="Arial" w:hAnsi="Arial" w:cs="Arial"/>
-        </w:rPr>
-        <w:t xml:space="preserve">a variável </w:t>
-      </w:r>
-      <w:r>
-        <w:rPr>
-          <w:rFonts w:ascii="Arial" w:hAnsi="Arial" w:cs="Arial"/>
-        </w:rPr>
-        <w:t xml:space="preserve">contador_clock, que </w:t>
-      </w:r>
-      <w:r>
-        <w:rPr>
-          <w:rFonts w:ascii="Arial" w:hAnsi="Arial" w:cs="Arial"/>
-        </w:rPr>
-        <w:t>incrementa de 0 até o valor definido na variável CICLOS_POR_BIT</w:t>
-      </w:r>
-      <w:r>
-        <w:rPr>
-          <w:rFonts w:ascii="Arial" w:hAnsi="Arial" w:cs="Arial"/>
-        </w:rPr>
-        <w:t>. Após o término desse período, o contador é reiniciado e o próximo bit da sequência é selecionado.</w:t>
-      </w:r>
-    </w:p>
-    <w:p>
-      <w:pPr>
-        <w:ind w:firstLine="567"/>
-        <w:rPr>
-          <w:rFonts w:ascii="Arial" w:hAnsi="Arial" w:cs="Arial"/>
-        </w:rPr>
-      </w:pPr>
-      <w:r>
-        <w:rPr>
-          <w:rFonts w:ascii="Arial" w:hAnsi="Arial" w:cs="Arial"/>
-        </w:rPr>
-        <w:t xml:space="preserve">Quando todos os bits </w:t>
-      </w:r>
-      <w:r>
-        <w:rPr>
-          <w:rFonts w:ascii="Arial" w:hAnsi="Arial" w:cs="Arial"/>
-        </w:rPr>
-        <w:t>da sequência de entrada são transmitidos (o vetor foi iterado de 0 até o valor definido em</w:t>
-      </w:r>
-      <w:r>
-        <w:rPr>
-          <w:rFonts w:ascii="Arial" w:hAnsi="Arial" w:cs="Arial"/>
-        </w:rPr>
-        <w:t xml:space="preserve"> NUM_BITS</w:t>
-      </w:r>
-      <w:r>
-        <w:rPr>
-          <w:rFonts w:ascii="Arial" w:hAnsi="Arial" w:cs="Arial"/>
-        </w:rPr>
-        <w:t>)</w:t>
-      </w:r>
-      <w:r>
-        <w:rPr>
-          <w:rFonts w:ascii="Arial" w:hAnsi="Arial" w:cs="Arial"/>
-        </w:rPr>
-        <w:t>, o circuito reinicia o processo,</w:t>
-      </w:r>
-      <w:r>
-        <w:rPr>
-          <w:rFonts w:ascii="Arial" w:hAnsi="Arial" w:cs="Arial"/>
-        </w:rPr>
-        <w:t xml:space="preserve"> </w:t>
-      </w:r>
-      <w:r>
-        <w:rPr>
-          <w:rFonts w:ascii="Arial" w:hAnsi="Arial" w:cs="Arial"/>
-        </w:rPr>
-        <w:t>iniciando um novo ciclo de transmissão.</w:t>
-      </w:r>
-    </w:p>
-    <w:p>
-      <w:pPr>
-        <w:ind w:firstLine="567"/>
-        <w:rPr>
-          <w:rFonts w:ascii="Arial" w:hAnsi="Arial" w:cs="Arial"/>
-        </w:rPr>
-      </w:pPr>
-    </w:p>
-    <w:p>
-      <w:pPr>
-        <w:ind w:firstLine="567"/>
-        <w:rPr>
-          <w:rFonts w:ascii="Arial" w:hAnsi="Arial" w:cs="Arial"/>
-        </w:rPr>
-      </w:pPr>
-    </w:p>
-    <w:p>
-      <w:pPr>
+        <w:t>6</w:t>
+      </w:r>
+      <w:r>
         <w:rPr>
           <w:rFonts w:ascii="Arial" w:hAnsi="Arial" w:cs="Arial"/>
           <w:b/>
@@ -1543,7 +1853,8 @@
           <w:sz w:val="28"/>
           <w:szCs w:val="28"/>
         </w:rPr>
-      </w:pPr>
+        <w:t xml:space="preserve">) </w:t>
+      </w:r>
       <w:r>
         <w:rPr>
           <w:rFonts w:ascii="Arial" w:hAnsi="Arial" w:cs="Arial"/>
@@ -1552,7 +1863,7 @@
           <w:sz w:val="28"/>
           <w:szCs w:val="28"/>
         </w:rPr>
-        <w:t>6</w:t>
+        <w:t xml:space="preserve">MAPEAMENTO FÍSICO NA </w:t>
       </w:r>
       <w:r>
         <w:rPr>
@@ -1562,17 +1873,7 @@
           <w:sz w:val="28"/>
           <w:szCs w:val="28"/>
         </w:rPr>
-        <w:t xml:space="preserve">) </w:t>
-      </w:r>
-      <w:r>
-        <w:rPr>
-          <w:rFonts w:ascii="Arial" w:hAnsi="Arial" w:cs="Arial"/>
-          <w:b/>
-          <w:bCs/>
-          <w:sz w:val="28"/>
-          <w:szCs w:val="28"/>
-        </w:rPr>
-        <w:t>MAPEAMENTO FÍSICO NA PORTA</w:t>
+        <w:t>PLACA</w:t>
       </w:r>
     </w:p>
     <w:p>
@@ -1744,14 +2045,25 @@
                 <w14:ligatures w14:val="none"/>
               </w:rPr>
             </w:pPr>
-            <w:r>
-              <w:rPr>
-                <w:rFonts w:ascii="Arial" w:eastAsia="Times New Roman" w:hAnsi="Arial" w:cs="Arial"/>
-                <w:kern w:val="0"/>
-                <w:lang w:eastAsia="pt-BR"/>
-                <w14:ligatures w14:val="none"/>
-              </w:rPr>
-              <w:t>entrada[0]</w:t>
+            <w:proofErr w:type="gramStart"/>
+            <w:r>
+              <w:rPr>
+                <w:rFonts w:ascii="Arial" w:eastAsia="Times New Roman" w:hAnsi="Arial" w:cs="Arial"/>
+                <w:kern w:val="0"/>
+                <w:lang w:eastAsia="pt-BR"/>
+                <w14:ligatures w14:val="none"/>
+              </w:rPr>
+              <w:t>entrada[</w:t>
+            </w:r>
+            <w:proofErr w:type="gramEnd"/>
+            <w:r>
+              <w:rPr>
+                <w:rFonts w:ascii="Arial" w:eastAsia="Times New Roman" w:hAnsi="Arial" w:cs="Arial"/>
+                <w:kern w:val="0"/>
+                <w:lang w:eastAsia="pt-BR"/>
+                <w14:ligatures w14:val="none"/>
+              </w:rPr>
+              <w:t>0]</w:t>
             </w:r>
           </w:p>
         </w:tc>
@@ -1830,14 +2142,25 @@
                 <w14:ligatures w14:val="none"/>
               </w:rPr>
             </w:pPr>
-            <w:r>
-              <w:rPr>
-                <w:rFonts w:ascii="Arial" w:eastAsia="Times New Roman" w:hAnsi="Arial" w:cs="Arial"/>
-                <w:kern w:val="0"/>
-                <w:lang w:eastAsia="pt-BR"/>
-                <w14:ligatures w14:val="none"/>
-              </w:rPr>
-              <w:t>entrada[1]</w:t>
+            <w:proofErr w:type="gramStart"/>
+            <w:r>
+              <w:rPr>
+                <w:rFonts w:ascii="Arial" w:eastAsia="Times New Roman" w:hAnsi="Arial" w:cs="Arial"/>
+                <w:kern w:val="0"/>
+                <w:lang w:eastAsia="pt-BR"/>
+                <w14:ligatures w14:val="none"/>
+              </w:rPr>
+              <w:t>entrada[</w:t>
+            </w:r>
+            <w:proofErr w:type="gramEnd"/>
+            <w:r>
+              <w:rPr>
+                <w:rFonts w:ascii="Arial" w:eastAsia="Times New Roman" w:hAnsi="Arial" w:cs="Arial"/>
+                <w:kern w:val="0"/>
+                <w:lang w:eastAsia="pt-BR"/>
+                <w14:ligatures w14:val="none"/>
+              </w:rPr>
+              <w:t>1]</w:t>
             </w:r>
           </w:p>
         </w:tc>
@@ -1916,14 +2239,25 @@
                 <w14:ligatures w14:val="none"/>
               </w:rPr>
             </w:pPr>
-            <w:r>
-              <w:rPr>
-                <w:rFonts w:ascii="Arial" w:eastAsia="Times New Roman" w:hAnsi="Arial" w:cs="Arial"/>
-                <w:kern w:val="0"/>
-                <w:lang w:eastAsia="pt-BR"/>
-                <w14:ligatures w14:val="none"/>
-              </w:rPr>
-              <w:t>entrada[2]</w:t>
+            <w:proofErr w:type="gramStart"/>
+            <w:r>
+              <w:rPr>
+                <w:rFonts w:ascii="Arial" w:eastAsia="Times New Roman" w:hAnsi="Arial" w:cs="Arial"/>
+                <w:kern w:val="0"/>
+                <w:lang w:eastAsia="pt-BR"/>
+                <w14:ligatures w14:val="none"/>
+              </w:rPr>
+              <w:t>entrada[</w:t>
+            </w:r>
+            <w:proofErr w:type="gramEnd"/>
+            <w:r>
+              <w:rPr>
+                <w:rFonts w:ascii="Arial" w:eastAsia="Times New Roman" w:hAnsi="Arial" w:cs="Arial"/>
+                <w:kern w:val="0"/>
+                <w:lang w:eastAsia="pt-BR"/>
+                <w14:ligatures w14:val="none"/>
+              </w:rPr>
+              <w:t>2]</w:t>
             </w:r>
           </w:p>
         </w:tc>
@@ -2002,14 +2336,25 @@
                 <w14:ligatures w14:val="none"/>
               </w:rPr>
             </w:pPr>
-            <w:r>
-              <w:rPr>
-                <w:rFonts w:ascii="Arial" w:eastAsia="Times New Roman" w:hAnsi="Arial" w:cs="Arial"/>
-                <w:kern w:val="0"/>
-                <w:lang w:eastAsia="pt-BR"/>
-                <w14:ligatures w14:val="none"/>
-              </w:rPr>
-              <w:t>entrada[3]</w:t>
+            <w:proofErr w:type="gramStart"/>
+            <w:r>
+              <w:rPr>
+                <w:rFonts w:ascii="Arial" w:eastAsia="Times New Roman" w:hAnsi="Arial" w:cs="Arial"/>
+                <w:kern w:val="0"/>
+                <w:lang w:eastAsia="pt-BR"/>
+                <w14:ligatures w14:val="none"/>
+              </w:rPr>
+              <w:t>entrada[</w:t>
+            </w:r>
+            <w:proofErr w:type="gramEnd"/>
+            <w:r>
+              <w:rPr>
+                <w:rFonts w:ascii="Arial" w:eastAsia="Times New Roman" w:hAnsi="Arial" w:cs="Arial"/>
+                <w:kern w:val="0"/>
+                <w:lang w:eastAsia="pt-BR"/>
+                <w14:ligatures w14:val="none"/>
+              </w:rPr>
+              <w:t>3]</w:t>
             </w:r>
           </w:p>
         </w:tc>
@@ -2088,14 +2433,25 @@
                 <w14:ligatures w14:val="none"/>
               </w:rPr>
             </w:pPr>
-            <w:r>
-              <w:rPr>
-                <w:rFonts w:ascii="Arial" w:eastAsia="Times New Roman" w:hAnsi="Arial" w:cs="Arial"/>
-                <w:kern w:val="0"/>
-                <w:lang w:eastAsia="pt-BR"/>
-                <w14:ligatures w14:val="none"/>
-              </w:rPr>
-              <w:t>entrada[4]</w:t>
+            <w:proofErr w:type="gramStart"/>
+            <w:r>
+              <w:rPr>
+                <w:rFonts w:ascii="Arial" w:eastAsia="Times New Roman" w:hAnsi="Arial" w:cs="Arial"/>
+                <w:kern w:val="0"/>
+                <w:lang w:eastAsia="pt-BR"/>
+                <w14:ligatures w14:val="none"/>
+              </w:rPr>
+              <w:t>entrada[</w:t>
+            </w:r>
+            <w:proofErr w:type="gramEnd"/>
+            <w:r>
+              <w:rPr>
+                <w:rFonts w:ascii="Arial" w:eastAsia="Times New Roman" w:hAnsi="Arial" w:cs="Arial"/>
+                <w:kern w:val="0"/>
+                <w:lang w:eastAsia="pt-BR"/>
+                <w14:ligatures w14:val="none"/>
+              </w:rPr>
+              <w:t>4]</w:t>
             </w:r>
           </w:p>
         </w:tc>
@@ -2174,14 +2530,25 @@
                 <w14:ligatures w14:val="none"/>
               </w:rPr>
             </w:pPr>
-            <w:r>
-              <w:rPr>
-                <w:rFonts w:ascii="Arial" w:eastAsia="Times New Roman" w:hAnsi="Arial" w:cs="Arial"/>
-                <w:kern w:val="0"/>
-                <w:lang w:eastAsia="pt-BR"/>
-                <w14:ligatures w14:val="none"/>
-              </w:rPr>
-              <w:t>entrada[5]</w:t>
+            <w:proofErr w:type="gramStart"/>
+            <w:r>
+              <w:rPr>
+                <w:rFonts w:ascii="Arial" w:eastAsia="Times New Roman" w:hAnsi="Arial" w:cs="Arial"/>
+                <w:kern w:val="0"/>
+                <w:lang w:eastAsia="pt-BR"/>
+                <w14:ligatures w14:val="none"/>
+              </w:rPr>
+              <w:t>entrada[</w:t>
+            </w:r>
+            <w:proofErr w:type="gramEnd"/>
+            <w:r>
+              <w:rPr>
+                <w:rFonts w:ascii="Arial" w:eastAsia="Times New Roman" w:hAnsi="Arial" w:cs="Arial"/>
+                <w:kern w:val="0"/>
+                <w:lang w:eastAsia="pt-BR"/>
+                <w14:ligatures w14:val="none"/>
+              </w:rPr>
+              <w:t>5]</w:t>
             </w:r>
           </w:p>
         </w:tc>
@@ -2260,14 +2627,25 @@
                 <w14:ligatures w14:val="none"/>
               </w:rPr>
             </w:pPr>
-            <w:r>
-              <w:rPr>
-                <w:rFonts w:ascii="Arial" w:eastAsia="Times New Roman" w:hAnsi="Arial" w:cs="Arial"/>
-                <w:kern w:val="0"/>
-                <w:lang w:eastAsia="pt-BR"/>
-                <w14:ligatures w14:val="none"/>
-              </w:rPr>
-              <w:t>entrada[6]</w:t>
+            <w:proofErr w:type="gramStart"/>
+            <w:r>
+              <w:rPr>
+                <w:rFonts w:ascii="Arial" w:eastAsia="Times New Roman" w:hAnsi="Arial" w:cs="Arial"/>
+                <w:kern w:val="0"/>
+                <w:lang w:eastAsia="pt-BR"/>
+                <w14:ligatures w14:val="none"/>
+              </w:rPr>
+              <w:t>entrada[</w:t>
+            </w:r>
+            <w:proofErr w:type="gramEnd"/>
+            <w:r>
+              <w:rPr>
+                <w:rFonts w:ascii="Arial" w:eastAsia="Times New Roman" w:hAnsi="Arial" w:cs="Arial"/>
+                <w:kern w:val="0"/>
+                <w:lang w:eastAsia="pt-BR"/>
+                <w14:ligatures w14:val="none"/>
+              </w:rPr>
+              <w:t>6]</w:t>
             </w:r>
           </w:p>
         </w:tc>
@@ -2346,14 +2724,25 @@
                 <w14:ligatures w14:val="none"/>
               </w:rPr>
             </w:pPr>
-            <w:r>
-              <w:rPr>
-                <w:rFonts w:ascii="Arial" w:eastAsia="Times New Roman" w:hAnsi="Arial" w:cs="Arial"/>
-                <w:kern w:val="0"/>
-                <w:lang w:eastAsia="pt-BR"/>
-                <w14:ligatures w14:val="none"/>
-              </w:rPr>
-              <w:t>entrada[7]</w:t>
+            <w:proofErr w:type="gramStart"/>
+            <w:r>
+              <w:rPr>
+                <w:rFonts w:ascii="Arial" w:eastAsia="Times New Roman" w:hAnsi="Arial" w:cs="Arial"/>
+                <w:kern w:val="0"/>
+                <w:lang w:eastAsia="pt-BR"/>
+                <w14:ligatures w14:val="none"/>
+              </w:rPr>
+              <w:t>entrada[</w:t>
+            </w:r>
+            <w:proofErr w:type="gramEnd"/>
+            <w:r>
+              <w:rPr>
+                <w:rFonts w:ascii="Arial" w:eastAsia="Times New Roman" w:hAnsi="Arial" w:cs="Arial"/>
+                <w:kern w:val="0"/>
+                <w:lang w:eastAsia="pt-BR"/>
+                <w14:ligatures w14:val="none"/>
+              </w:rPr>
+              <w:t>7]</w:t>
             </w:r>
           </w:p>
         </w:tc>
@@ -2432,14 +2821,25 @@
                 <w14:ligatures w14:val="none"/>
               </w:rPr>
             </w:pPr>
-            <w:r>
-              <w:rPr>
-                <w:rFonts w:ascii="Arial" w:eastAsia="Times New Roman" w:hAnsi="Arial" w:cs="Arial"/>
-                <w:kern w:val="0"/>
-                <w:lang w:eastAsia="pt-BR"/>
-                <w14:ligatures w14:val="none"/>
-              </w:rPr>
-              <w:t>entrada[8]</w:t>
+            <w:proofErr w:type="gramStart"/>
+            <w:r>
+              <w:rPr>
+                <w:rFonts w:ascii="Arial" w:eastAsia="Times New Roman" w:hAnsi="Arial" w:cs="Arial"/>
+                <w:kern w:val="0"/>
+                <w:lang w:eastAsia="pt-BR"/>
+                <w14:ligatures w14:val="none"/>
+              </w:rPr>
+              <w:t>entrada[</w:t>
+            </w:r>
+            <w:proofErr w:type="gramEnd"/>
+            <w:r>
+              <w:rPr>
+                <w:rFonts w:ascii="Arial" w:eastAsia="Times New Roman" w:hAnsi="Arial" w:cs="Arial"/>
+                <w:kern w:val="0"/>
+                <w:lang w:eastAsia="pt-BR"/>
+                <w14:ligatures w14:val="none"/>
+              </w:rPr>
+              <w:t>8]</w:t>
             </w:r>
           </w:p>
         </w:tc>
@@ -2518,14 +2918,25 @@
                 <w14:ligatures w14:val="none"/>
               </w:rPr>
             </w:pPr>
-            <w:r>
-              <w:rPr>
-                <w:rFonts w:ascii="Arial" w:eastAsia="Times New Roman" w:hAnsi="Arial" w:cs="Arial"/>
-                <w:kern w:val="0"/>
-                <w:lang w:eastAsia="pt-BR"/>
-                <w14:ligatures w14:val="none"/>
-              </w:rPr>
-              <w:t>entrada[9]</w:t>
+            <w:proofErr w:type="gramStart"/>
+            <w:r>
+              <w:rPr>
+                <w:rFonts w:ascii="Arial" w:eastAsia="Times New Roman" w:hAnsi="Arial" w:cs="Arial"/>
+                <w:kern w:val="0"/>
+                <w:lang w:eastAsia="pt-BR"/>
+                <w14:ligatures w14:val="none"/>
+              </w:rPr>
+              <w:t>entrada[</w:t>
+            </w:r>
+            <w:proofErr w:type="gramEnd"/>
+            <w:r>
+              <w:rPr>
+                <w:rFonts w:ascii="Arial" w:eastAsia="Times New Roman" w:hAnsi="Arial" w:cs="Arial"/>
+                <w:kern w:val="0"/>
+                <w:lang w:eastAsia="pt-BR"/>
+                <w14:ligatures w14:val="none"/>
+              </w:rPr>
+              <w:t>9]</w:t>
             </w:r>
           </w:p>
         </w:tc>
@@ -2604,14 +3015,25 @@
                 <w14:ligatures w14:val="none"/>
               </w:rPr>
             </w:pPr>
-            <w:r>
-              <w:rPr>
-                <w:rFonts w:ascii="Arial" w:eastAsia="Times New Roman" w:hAnsi="Arial" w:cs="Arial"/>
-                <w:kern w:val="0"/>
-                <w:lang w:eastAsia="pt-BR"/>
-                <w14:ligatures w14:val="none"/>
-              </w:rPr>
-              <w:t>entrada[10]</w:t>
+            <w:proofErr w:type="gramStart"/>
+            <w:r>
+              <w:rPr>
+                <w:rFonts w:ascii="Arial" w:eastAsia="Times New Roman" w:hAnsi="Arial" w:cs="Arial"/>
+                <w:kern w:val="0"/>
+                <w:lang w:eastAsia="pt-BR"/>
+                <w14:ligatures w14:val="none"/>
+              </w:rPr>
+              <w:t>entrada[</w:t>
+            </w:r>
+            <w:proofErr w:type="gramEnd"/>
+            <w:r>
+              <w:rPr>
+                <w:rFonts w:ascii="Arial" w:eastAsia="Times New Roman" w:hAnsi="Arial" w:cs="Arial"/>
+                <w:kern w:val="0"/>
+                <w:lang w:eastAsia="pt-BR"/>
+                <w14:ligatures w14:val="none"/>
+              </w:rPr>
+              <w:t>10]</w:t>
             </w:r>
           </w:p>
         </w:tc>
@@ -2690,14 +3112,25 @@
                 <w14:ligatures w14:val="none"/>
               </w:rPr>
             </w:pPr>
-            <w:r>
-              <w:rPr>
-                <w:rFonts w:ascii="Arial" w:eastAsia="Times New Roman" w:hAnsi="Arial" w:cs="Arial"/>
-                <w:kern w:val="0"/>
-                <w:lang w:eastAsia="pt-BR"/>
-                <w14:ligatures w14:val="none"/>
-              </w:rPr>
-              <w:t>entrada[11]</w:t>
+            <w:proofErr w:type="gramStart"/>
+            <w:r>
+              <w:rPr>
+                <w:rFonts w:ascii="Arial" w:eastAsia="Times New Roman" w:hAnsi="Arial" w:cs="Arial"/>
+                <w:kern w:val="0"/>
+                <w:lang w:eastAsia="pt-BR"/>
+                <w14:ligatures w14:val="none"/>
+              </w:rPr>
+              <w:t>entrada[</w:t>
+            </w:r>
+            <w:proofErr w:type="gramEnd"/>
+            <w:r>
+              <w:rPr>
+                <w:rFonts w:ascii="Arial" w:eastAsia="Times New Roman" w:hAnsi="Arial" w:cs="Arial"/>
+                <w:kern w:val="0"/>
+                <w:lang w:eastAsia="pt-BR"/>
+                <w14:ligatures w14:val="none"/>
+              </w:rPr>
+              <w:t>11]</w:t>
             </w:r>
           </w:p>
         </w:tc>
@@ -2776,14 +3209,25 @@
                 <w14:ligatures w14:val="none"/>
               </w:rPr>
             </w:pPr>
-            <w:r>
-              <w:rPr>
-                <w:rFonts w:ascii="Arial" w:eastAsia="Times New Roman" w:hAnsi="Arial" w:cs="Arial"/>
-                <w:kern w:val="0"/>
-                <w:lang w:eastAsia="pt-BR"/>
-                <w14:ligatures w14:val="none"/>
-              </w:rPr>
-              <w:t>entrada[12]</w:t>
+            <w:proofErr w:type="gramStart"/>
+            <w:r>
+              <w:rPr>
+                <w:rFonts w:ascii="Arial" w:eastAsia="Times New Roman" w:hAnsi="Arial" w:cs="Arial"/>
+                <w:kern w:val="0"/>
+                <w:lang w:eastAsia="pt-BR"/>
+                <w14:ligatures w14:val="none"/>
+              </w:rPr>
+              <w:t>entrada[</w:t>
+            </w:r>
+            <w:proofErr w:type="gramEnd"/>
+            <w:r>
+              <w:rPr>
+                <w:rFonts w:ascii="Arial" w:eastAsia="Times New Roman" w:hAnsi="Arial" w:cs="Arial"/>
+                <w:kern w:val="0"/>
+                <w:lang w:eastAsia="pt-BR"/>
+                <w14:ligatures w14:val="none"/>
+              </w:rPr>
+              <w:t>12]</w:t>
             </w:r>
           </w:p>
         </w:tc>
@@ -2862,14 +3306,25 @@
                 <w14:ligatures w14:val="none"/>
               </w:rPr>
             </w:pPr>
-            <w:r>
-              <w:rPr>
-                <w:rFonts w:ascii="Arial" w:eastAsia="Times New Roman" w:hAnsi="Arial" w:cs="Arial"/>
-                <w:kern w:val="0"/>
-                <w:lang w:eastAsia="pt-BR"/>
-                <w14:ligatures w14:val="none"/>
-              </w:rPr>
-              <w:t>entrada[13]</w:t>
+            <w:proofErr w:type="gramStart"/>
+            <w:r>
+              <w:rPr>
+                <w:rFonts w:ascii="Arial" w:eastAsia="Times New Roman" w:hAnsi="Arial" w:cs="Arial"/>
+                <w:kern w:val="0"/>
+                <w:lang w:eastAsia="pt-BR"/>
+                <w14:ligatures w14:val="none"/>
+              </w:rPr>
+              <w:t>entrada[</w:t>
+            </w:r>
+            <w:proofErr w:type="gramEnd"/>
+            <w:r>
+              <w:rPr>
+                <w:rFonts w:ascii="Arial" w:eastAsia="Times New Roman" w:hAnsi="Arial" w:cs="Arial"/>
+                <w:kern w:val="0"/>
+                <w:lang w:eastAsia="pt-BR"/>
+                <w14:ligatures w14:val="none"/>
+              </w:rPr>
+              <w:t>13]</w:t>
             </w:r>
           </w:p>
         </w:tc>
@@ -2948,14 +3403,25 @@
                 <w14:ligatures w14:val="none"/>
               </w:rPr>
             </w:pPr>
-            <w:r>
-              <w:rPr>
-                <w:rFonts w:ascii="Arial" w:eastAsia="Times New Roman" w:hAnsi="Arial" w:cs="Arial"/>
-                <w:kern w:val="0"/>
-                <w:lang w:eastAsia="pt-BR"/>
-                <w14:ligatures w14:val="none"/>
-              </w:rPr>
-              <w:t>entrada[14]</w:t>
+            <w:proofErr w:type="gramStart"/>
+            <w:r>
+              <w:rPr>
+                <w:rFonts w:ascii="Arial" w:eastAsia="Times New Roman" w:hAnsi="Arial" w:cs="Arial"/>
+                <w:kern w:val="0"/>
+                <w:lang w:eastAsia="pt-BR"/>
+                <w14:ligatures w14:val="none"/>
+              </w:rPr>
+              <w:t>entrada[</w:t>
+            </w:r>
+            <w:proofErr w:type="gramEnd"/>
+            <w:r>
+              <w:rPr>
+                <w:rFonts w:ascii="Arial" w:eastAsia="Times New Roman" w:hAnsi="Arial" w:cs="Arial"/>
+                <w:kern w:val="0"/>
+                <w:lang w:eastAsia="pt-BR"/>
+                <w14:ligatures w14:val="none"/>
+              </w:rPr>
+              <w:t>14]</w:t>
             </w:r>
           </w:p>
         </w:tc>
@@ -3034,14 +3500,25 @@
                 <w14:ligatures w14:val="none"/>
               </w:rPr>
             </w:pPr>
-            <w:r>
-              <w:rPr>
-                <w:rFonts w:ascii="Arial" w:eastAsia="Times New Roman" w:hAnsi="Arial" w:cs="Arial"/>
-                <w:kern w:val="0"/>
-                <w:lang w:eastAsia="pt-BR"/>
-                <w14:ligatures w14:val="none"/>
-              </w:rPr>
-              <w:t>entrada[15]</w:t>
+            <w:proofErr w:type="gramStart"/>
+            <w:r>
+              <w:rPr>
+                <w:rFonts w:ascii="Arial" w:eastAsia="Times New Roman" w:hAnsi="Arial" w:cs="Arial"/>
+                <w:kern w:val="0"/>
+                <w:lang w:eastAsia="pt-BR"/>
+                <w14:ligatures w14:val="none"/>
+              </w:rPr>
+              <w:t>entrada[</w:t>
+            </w:r>
+            <w:proofErr w:type="gramEnd"/>
+            <w:r>
+              <w:rPr>
+                <w:rFonts w:ascii="Arial" w:eastAsia="Times New Roman" w:hAnsi="Arial" w:cs="Arial"/>
+                <w:kern w:val="0"/>
+                <w:lang w:eastAsia="pt-BR"/>
+                <w14:ligatures w14:val="none"/>
+              </w:rPr>
+              <w:t>15]</w:t>
             </w:r>
           </w:p>
         </w:tc>
@@ -3080,6 +3557,7 @@
           </w:tcPr>
           <w:p>
             <w:pPr>
+              <w:keepNext/>
               <w:jc w:val="center"/>
               <w:rPr>
                 <w:rFonts w:ascii="Arial" w:eastAsia="Times New Roman" w:hAnsi="Arial" w:cs="Arial"/>
@@ -3103,12 +3581,25 @@
     </w:tbl>
     <w:p>
       <w:pPr>
-        <w:jc w:val="both"/>
-        <w:rPr>
-          <w:rFonts w:ascii="Arial" w:hAnsi="Arial" w:cs="Arial"/>
-        </w:rPr>
-      </w:pPr>
+        <w:pStyle w:val="Legenda"/>
+        <w:jc w:val="center"/>
+      </w:pPr>
+      <w:r>
+        <w:t xml:space="preserve">Tabela </w:t>
+      </w:r>
+      <w:fldSimple w:instr=" SEQ Tabela \* ARABIC ">
+        <w:r>
+          <w:rPr>
+            <w:noProof/>
+          </w:rPr>
+          <w:t>3</w:t>
+        </w:r>
+      </w:fldSimple>
+      <w:r>
+        <w:t xml:space="preserve"> - Mapeamento da entrada de dados do circuito</w:t>
+      </w:r>
     </w:p>
+    <w:p/>
     <w:p>
       <w:pPr>
         <w:ind w:firstLine="567"/>
@@ -3121,19 +3612,7 @@
         <w:rPr>
           <w:rFonts w:ascii="Arial" w:hAnsi="Arial" w:cs="Arial"/>
         </w:rPr>
-        <w:t xml:space="preserve">A tabela </w:t>
-      </w:r>
-      <w:r>
-        <w:rPr>
-          <w:rFonts w:ascii="Arial" w:hAnsi="Arial" w:cs="Arial"/>
-        </w:rPr>
-        <w:t xml:space="preserve">abaixo, </w:t>
-      </w:r>
-      <w:r>
-        <w:rPr>
-          <w:rFonts w:ascii="Arial" w:hAnsi="Arial" w:cs="Arial"/>
-        </w:rPr>
-        <w:t>especifica a relação entre os sinais e pinos que representam a saída do sinal modulado.</w:t>
+        <w:t>A tabela abaixo, especifica a relação entre os sinais e pinos que representam a saída do sinal modulado.</w:t>
       </w:r>
       <w:r>
         <w:rPr>
@@ -3145,67 +3624,7 @@
         <w:rPr>
           <w:rFonts w:ascii="Arial" w:hAnsi="Arial" w:cs="Arial"/>
         </w:rPr>
-        <w:t xml:space="preserve">No código VHDL, o sinal de </w:t>
-      </w:r>
-      <w:r>
-        <w:rPr>
-          <w:rFonts w:ascii="Arial" w:hAnsi="Arial" w:cs="Arial"/>
-        </w:rPr>
-        <w:t>saída</w:t>
-      </w:r>
-      <w:r>
-        <w:rPr>
-          <w:rFonts w:ascii="Arial" w:hAnsi="Arial" w:cs="Arial"/>
-        </w:rPr>
-        <w:t xml:space="preserve"> é um vetor de 16 posições (de 0 a 15) que </w:t>
-      </w:r>
-      <w:r>
-        <w:rPr>
-          <w:rFonts w:ascii="Arial" w:hAnsi="Arial" w:cs="Arial"/>
-        </w:rPr>
-        <w:t xml:space="preserve">serve de referência para a série de 16 LEDs presentes no circuito. </w:t>
-      </w:r>
-      <w:r>
-        <w:rPr>
-          <w:rFonts w:ascii="Arial" w:hAnsi="Arial" w:cs="Arial"/>
-        </w:rPr>
-        <w:t xml:space="preserve"> A primeira linha, por exemplo, diz que o primeiro bit do vetor (o mais significativo) </w:t>
-      </w:r>
-      <w:r>
-        <w:rPr>
-          <w:rFonts w:ascii="Arial" w:hAnsi="Arial" w:cs="Arial"/>
-        </w:rPr>
-        <w:t>é externalizado no pino</w:t>
-      </w:r>
-      <w:r>
-        <w:rPr>
-          <w:rFonts w:ascii="Arial" w:hAnsi="Arial" w:cs="Arial"/>
-        </w:rPr>
-        <w:t xml:space="preserve"> </w:t>
-      </w:r>
-      <w:r>
-        <w:rPr>
-          <w:rFonts w:ascii="Arial" w:hAnsi="Arial" w:cs="Arial"/>
-        </w:rPr>
-        <w:t>L1</w:t>
-      </w:r>
-      <w:r>
-        <w:rPr>
-          <w:rFonts w:ascii="Arial" w:hAnsi="Arial" w:cs="Arial"/>
-        </w:rPr>
-        <w:t xml:space="preserve">, o primeiro </w:t>
-      </w:r>
-      <w:r>
-        <w:rPr>
-          <w:rFonts w:ascii="Arial" w:hAnsi="Arial" w:cs="Arial"/>
-        </w:rPr>
-        <w:t>LED</w:t>
-      </w:r>
-      <w:r>
-        <w:rPr>
-          <w:rFonts w:ascii="Arial" w:hAnsi="Arial" w:cs="Arial"/>
-        </w:rPr>
-        <w:t xml:space="preserve"> da esquerda para a direita:</w:t>
+        <w:t>No código VHDL, o sinal de saída é um vetor de 16 posições (de 0 a 15) que serve de referência para a série de 16 LEDs presentes no circuito.  A primeira linha, por exemplo, diz que o primeiro bit do vetor (o mais significativo) é externalizado no pino L1, o primeiro LED da esquerda para a direita:</w:t>
       </w:r>
     </w:p>
     <w:p>
@@ -3329,11 +3748,33 @@
                 <w:rFonts w:ascii="Arial" w:hAnsi="Arial" w:cs="Arial"/>
               </w:rPr>
             </w:pPr>
-            <w:r>
-              <w:rPr>
-                <w:rFonts w:ascii="Arial" w:hAnsi="Arial" w:cs="Arial"/>
-              </w:rPr>
-              <w:t>saida_leds[0]</w:t>
+            <w:proofErr w:type="spellStart"/>
+            <w:r>
+              <w:rPr>
+                <w:rFonts w:ascii="Arial" w:hAnsi="Arial" w:cs="Arial"/>
+              </w:rPr>
+              <w:t>saida_</w:t>
+            </w:r>
+            <w:proofErr w:type="gramStart"/>
+            <w:r>
+              <w:rPr>
+                <w:rFonts w:ascii="Arial" w:hAnsi="Arial" w:cs="Arial"/>
+              </w:rPr>
+              <w:t>leds</w:t>
+            </w:r>
+            <w:proofErr w:type="spellEnd"/>
+            <w:r>
+              <w:rPr>
+                <w:rFonts w:ascii="Arial" w:hAnsi="Arial" w:cs="Arial"/>
+              </w:rPr>
+              <w:t>[</w:t>
+            </w:r>
+            <w:proofErr w:type="gramEnd"/>
+            <w:r>
+              <w:rPr>
+                <w:rFonts w:ascii="Arial" w:hAnsi="Arial" w:cs="Arial"/>
+              </w:rPr>
+              <w:t>0]</w:t>
             </w:r>
           </w:p>
         </w:tc>
@@ -3400,11 +3841,34 @@
                 <w:rFonts w:ascii="Arial" w:hAnsi="Arial" w:cs="Arial"/>
               </w:rPr>
             </w:pPr>
-            <w:r>
-              <w:rPr>
-                <w:rFonts w:ascii="Arial" w:hAnsi="Arial" w:cs="Arial"/>
-              </w:rPr>
-              <w:t>saida_leds[1]</w:t>
+            <w:proofErr w:type="spellStart"/>
+            <w:r>
+              <w:rPr>
+                <w:rFonts w:ascii="Arial" w:hAnsi="Arial" w:cs="Arial"/>
+              </w:rPr>
+              <w:lastRenderedPageBreak/>
+              <w:t>saida_</w:t>
+            </w:r>
+            <w:proofErr w:type="gramStart"/>
+            <w:r>
+              <w:rPr>
+                <w:rFonts w:ascii="Arial" w:hAnsi="Arial" w:cs="Arial"/>
+              </w:rPr>
+              <w:t>leds</w:t>
+            </w:r>
+            <w:proofErr w:type="spellEnd"/>
+            <w:r>
+              <w:rPr>
+                <w:rFonts w:ascii="Arial" w:hAnsi="Arial" w:cs="Arial"/>
+              </w:rPr>
+              <w:t>[</w:t>
+            </w:r>
+            <w:proofErr w:type="gramEnd"/>
+            <w:r>
+              <w:rPr>
+                <w:rFonts w:ascii="Arial" w:hAnsi="Arial" w:cs="Arial"/>
+              </w:rPr>
+              <w:t>1]</w:t>
             </w:r>
           </w:p>
         </w:tc>
@@ -3471,11 +3935,33 @@
                 <w:rFonts w:ascii="Arial" w:hAnsi="Arial" w:cs="Arial"/>
               </w:rPr>
             </w:pPr>
-            <w:r>
-              <w:rPr>
-                <w:rFonts w:ascii="Arial" w:hAnsi="Arial" w:cs="Arial"/>
-              </w:rPr>
-              <w:t>saida_leds[2]</w:t>
+            <w:proofErr w:type="spellStart"/>
+            <w:r>
+              <w:rPr>
+                <w:rFonts w:ascii="Arial" w:hAnsi="Arial" w:cs="Arial"/>
+              </w:rPr>
+              <w:t>saida_</w:t>
+            </w:r>
+            <w:proofErr w:type="gramStart"/>
+            <w:r>
+              <w:rPr>
+                <w:rFonts w:ascii="Arial" w:hAnsi="Arial" w:cs="Arial"/>
+              </w:rPr>
+              <w:t>leds</w:t>
+            </w:r>
+            <w:proofErr w:type="spellEnd"/>
+            <w:r>
+              <w:rPr>
+                <w:rFonts w:ascii="Arial" w:hAnsi="Arial" w:cs="Arial"/>
+              </w:rPr>
+              <w:t>[</w:t>
+            </w:r>
+            <w:proofErr w:type="gramEnd"/>
+            <w:r>
+              <w:rPr>
+                <w:rFonts w:ascii="Arial" w:hAnsi="Arial" w:cs="Arial"/>
+              </w:rPr>
+              <w:t>2]</w:t>
             </w:r>
           </w:p>
         </w:tc>
@@ -3542,11 +4028,33 @@
                 <w:rFonts w:ascii="Arial" w:hAnsi="Arial" w:cs="Arial"/>
               </w:rPr>
             </w:pPr>
-            <w:r>
-              <w:rPr>
-                <w:rFonts w:ascii="Arial" w:hAnsi="Arial" w:cs="Arial"/>
-              </w:rPr>
-              <w:t>saida_leds[3]</w:t>
+            <w:proofErr w:type="spellStart"/>
+            <w:r>
+              <w:rPr>
+                <w:rFonts w:ascii="Arial" w:hAnsi="Arial" w:cs="Arial"/>
+              </w:rPr>
+              <w:t>saida_</w:t>
+            </w:r>
+            <w:proofErr w:type="gramStart"/>
+            <w:r>
+              <w:rPr>
+                <w:rFonts w:ascii="Arial" w:hAnsi="Arial" w:cs="Arial"/>
+              </w:rPr>
+              <w:t>leds</w:t>
+            </w:r>
+            <w:proofErr w:type="spellEnd"/>
+            <w:r>
+              <w:rPr>
+                <w:rFonts w:ascii="Arial" w:hAnsi="Arial" w:cs="Arial"/>
+              </w:rPr>
+              <w:t>[</w:t>
+            </w:r>
+            <w:proofErr w:type="gramEnd"/>
+            <w:r>
+              <w:rPr>
+                <w:rFonts w:ascii="Arial" w:hAnsi="Arial" w:cs="Arial"/>
+              </w:rPr>
+              <w:t>3]</w:t>
             </w:r>
           </w:p>
         </w:tc>
@@ -3613,12 +4121,33 @@
                 <w:rFonts w:ascii="Arial" w:hAnsi="Arial" w:cs="Arial"/>
               </w:rPr>
             </w:pPr>
-            <w:r>
-              <w:rPr>
-                <w:rFonts w:ascii="Arial" w:hAnsi="Arial" w:cs="Arial"/>
-              </w:rPr>
-              <w:lastRenderedPageBreak/>
-              <w:t>saida_leds[4]</w:t>
+            <w:proofErr w:type="spellStart"/>
+            <w:r>
+              <w:rPr>
+                <w:rFonts w:ascii="Arial" w:hAnsi="Arial" w:cs="Arial"/>
+              </w:rPr>
+              <w:t>saida_</w:t>
+            </w:r>
+            <w:proofErr w:type="gramStart"/>
+            <w:r>
+              <w:rPr>
+                <w:rFonts w:ascii="Arial" w:hAnsi="Arial" w:cs="Arial"/>
+              </w:rPr>
+              <w:t>leds</w:t>
+            </w:r>
+            <w:proofErr w:type="spellEnd"/>
+            <w:r>
+              <w:rPr>
+                <w:rFonts w:ascii="Arial" w:hAnsi="Arial" w:cs="Arial"/>
+              </w:rPr>
+              <w:t>[</w:t>
+            </w:r>
+            <w:proofErr w:type="gramEnd"/>
+            <w:r>
+              <w:rPr>
+                <w:rFonts w:ascii="Arial" w:hAnsi="Arial" w:cs="Arial"/>
+              </w:rPr>
+              <w:t>4]</w:t>
             </w:r>
           </w:p>
         </w:tc>
@@ -3685,11 +4214,33 @@
                 <w:rFonts w:ascii="Arial" w:hAnsi="Arial" w:cs="Arial"/>
               </w:rPr>
             </w:pPr>
-            <w:r>
-              <w:rPr>
-                <w:rFonts w:ascii="Arial" w:hAnsi="Arial" w:cs="Arial"/>
-              </w:rPr>
-              <w:t>saida_leds[5]</w:t>
+            <w:proofErr w:type="spellStart"/>
+            <w:r>
+              <w:rPr>
+                <w:rFonts w:ascii="Arial" w:hAnsi="Arial" w:cs="Arial"/>
+              </w:rPr>
+              <w:t>saida_</w:t>
+            </w:r>
+            <w:proofErr w:type="gramStart"/>
+            <w:r>
+              <w:rPr>
+                <w:rFonts w:ascii="Arial" w:hAnsi="Arial" w:cs="Arial"/>
+              </w:rPr>
+              <w:t>leds</w:t>
+            </w:r>
+            <w:proofErr w:type="spellEnd"/>
+            <w:r>
+              <w:rPr>
+                <w:rFonts w:ascii="Arial" w:hAnsi="Arial" w:cs="Arial"/>
+              </w:rPr>
+              <w:t>[</w:t>
+            </w:r>
+            <w:proofErr w:type="gramEnd"/>
+            <w:r>
+              <w:rPr>
+                <w:rFonts w:ascii="Arial" w:hAnsi="Arial" w:cs="Arial"/>
+              </w:rPr>
+              <w:t>5]</w:t>
             </w:r>
           </w:p>
         </w:tc>
@@ -3756,11 +4307,33 @@
                 <w:rFonts w:ascii="Arial" w:hAnsi="Arial" w:cs="Arial"/>
               </w:rPr>
             </w:pPr>
-            <w:r>
-              <w:rPr>
-                <w:rFonts w:ascii="Arial" w:hAnsi="Arial" w:cs="Arial"/>
-              </w:rPr>
-              <w:t>saida_leds[6]</w:t>
+            <w:proofErr w:type="spellStart"/>
+            <w:r>
+              <w:rPr>
+                <w:rFonts w:ascii="Arial" w:hAnsi="Arial" w:cs="Arial"/>
+              </w:rPr>
+              <w:t>saida_</w:t>
+            </w:r>
+            <w:proofErr w:type="gramStart"/>
+            <w:r>
+              <w:rPr>
+                <w:rFonts w:ascii="Arial" w:hAnsi="Arial" w:cs="Arial"/>
+              </w:rPr>
+              <w:t>leds</w:t>
+            </w:r>
+            <w:proofErr w:type="spellEnd"/>
+            <w:r>
+              <w:rPr>
+                <w:rFonts w:ascii="Arial" w:hAnsi="Arial" w:cs="Arial"/>
+              </w:rPr>
+              <w:t>[</w:t>
+            </w:r>
+            <w:proofErr w:type="gramEnd"/>
+            <w:r>
+              <w:rPr>
+                <w:rFonts w:ascii="Arial" w:hAnsi="Arial" w:cs="Arial"/>
+              </w:rPr>
+              <w:t>6]</w:t>
             </w:r>
           </w:p>
         </w:tc>
@@ -3827,11 +4400,33 @@
                 <w:rFonts w:ascii="Arial" w:hAnsi="Arial" w:cs="Arial"/>
               </w:rPr>
             </w:pPr>
-            <w:r>
-              <w:rPr>
-                <w:rFonts w:ascii="Arial" w:hAnsi="Arial" w:cs="Arial"/>
-              </w:rPr>
-              <w:t>saida_leds[7]</w:t>
+            <w:proofErr w:type="spellStart"/>
+            <w:r>
+              <w:rPr>
+                <w:rFonts w:ascii="Arial" w:hAnsi="Arial" w:cs="Arial"/>
+              </w:rPr>
+              <w:t>saida_</w:t>
+            </w:r>
+            <w:proofErr w:type="gramStart"/>
+            <w:r>
+              <w:rPr>
+                <w:rFonts w:ascii="Arial" w:hAnsi="Arial" w:cs="Arial"/>
+              </w:rPr>
+              <w:t>leds</w:t>
+            </w:r>
+            <w:proofErr w:type="spellEnd"/>
+            <w:r>
+              <w:rPr>
+                <w:rFonts w:ascii="Arial" w:hAnsi="Arial" w:cs="Arial"/>
+              </w:rPr>
+              <w:t>[</w:t>
+            </w:r>
+            <w:proofErr w:type="gramEnd"/>
+            <w:r>
+              <w:rPr>
+                <w:rFonts w:ascii="Arial" w:hAnsi="Arial" w:cs="Arial"/>
+              </w:rPr>
+              <w:t>7]</w:t>
             </w:r>
           </w:p>
         </w:tc>
@@ -3898,11 +4493,33 @@
                 <w:rFonts w:ascii="Arial" w:hAnsi="Arial" w:cs="Arial"/>
               </w:rPr>
             </w:pPr>
-            <w:r>
-              <w:rPr>
-                <w:rFonts w:ascii="Arial" w:hAnsi="Arial" w:cs="Arial"/>
-              </w:rPr>
-              <w:t>saida_leds[8]</w:t>
+            <w:proofErr w:type="spellStart"/>
+            <w:r>
+              <w:rPr>
+                <w:rFonts w:ascii="Arial" w:hAnsi="Arial" w:cs="Arial"/>
+              </w:rPr>
+              <w:t>saida_</w:t>
+            </w:r>
+            <w:proofErr w:type="gramStart"/>
+            <w:r>
+              <w:rPr>
+                <w:rFonts w:ascii="Arial" w:hAnsi="Arial" w:cs="Arial"/>
+              </w:rPr>
+              <w:t>leds</w:t>
+            </w:r>
+            <w:proofErr w:type="spellEnd"/>
+            <w:r>
+              <w:rPr>
+                <w:rFonts w:ascii="Arial" w:hAnsi="Arial" w:cs="Arial"/>
+              </w:rPr>
+              <w:t>[</w:t>
+            </w:r>
+            <w:proofErr w:type="gramEnd"/>
+            <w:r>
+              <w:rPr>
+                <w:rFonts w:ascii="Arial" w:hAnsi="Arial" w:cs="Arial"/>
+              </w:rPr>
+              <w:t>8]</w:t>
             </w:r>
           </w:p>
         </w:tc>
@@ -3969,11 +4586,33 @@
                 <w:rFonts w:ascii="Arial" w:hAnsi="Arial" w:cs="Arial"/>
               </w:rPr>
             </w:pPr>
-            <w:r>
-              <w:rPr>
-                <w:rFonts w:ascii="Arial" w:hAnsi="Arial" w:cs="Arial"/>
-              </w:rPr>
-              <w:t>saida_leds[9]</w:t>
+            <w:proofErr w:type="spellStart"/>
+            <w:r>
+              <w:rPr>
+                <w:rFonts w:ascii="Arial" w:hAnsi="Arial" w:cs="Arial"/>
+              </w:rPr>
+              <w:t>saida_</w:t>
+            </w:r>
+            <w:proofErr w:type="gramStart"/>
+            <w:r>
+              <w:rPr>
+                <w:rFonts w:ascii="Arial" w:hAnsi="Arial" w:cs="Arial"/>
+              </w:rPr>
+              <w:t>leds</w:t>
+            </w:r>
+            <w:proofErr w:type="spellEnd"/>
+            <w:r>
+              <w:rPr>
+                <w:rFonts w:ascii="Arial" w:hAnsi="Arial" w:cs="Arial"/>
+              </w:rPr>
+              <w:t>[</w:t>
+            </w:r>
+            <w:proofErr w:type="gramEnd"/>
+            <w:r>
+              <w:rPr>
+                <w:rFonts w:ascii="Arial" w:hAnsi="Arial" w:cs="Arial"/>
+              </w:rPr>
+              <w:t>9]</w:t>
             </w:r>
           </w:p>
         </w:tc>
@@ -4040,11 +4679,33 @@
                 <w:rFonts w:ascii="Arial" w:hAnsi="Arial" w:cs="Arial"/>
               </w:rPr>
             </w:pPr>
-            <w:r>
-              <w:rPr>
-                <w:rFonts w:ascii="Arial" w:hAnsi="Arial" w:cs="Arial"/>
-              </w:rPr>
-              <w:t>saida_leds[10]</w:t>
+            <w:proofErr w:type="spellStart"/>
+            <w:r>
+              <w:rPr>
+                <w:rFonts w:ascii="Arial" w:hAnsi="Arial" w:cs="Arial"/>
+              </w:rPr>
+              <w:t>saida_</w:t>
+            </w:r>
+            <w:proofErr w:type="gramStart"/>
+            <w:r>
+              <w:rPr>
+                <w:rFonts w:ascii="Arial" w:hAnsi="Arial" w:cs="Arial"/>
+              </w:rPr>
+              <w:t>leds</w:t>
+            </w:r>
+            <w:proofErr w:type="spellEnd"/>
+            <w:r>
+              <w:rPr>
+                <w:rFonts w:ascii="Arial" w:hAnsi="Arial" w:cs="Arial"/>
+              </w:rPr>
+              <w:t>[</w:t>
+            </w:r>
+            <w:proofErr w:type="gramEnd"/>
+            <w:r>
+              <w:rPr>
+                <w:rFonts w:ascii="Arial" w:hAnsi="Arial" w:cs="Arial"/>
+              </w:rPr>
+              <w:t>10]</w:t>
             </w:r>
           </w:p>
         </w:tc>
@@ -4111,11 +4772,33 @@
                 <w:rFonts w:ascii="Arial" w:hAnsi="Arial" w:cs="Arial"/>
               </w:rPr>
             </w:pPr>
-            <w:r>
-              <w:rPr>
-                <w:rFonts w:ascii="Arial" w:hAnsi="Arial" w:cs="Arial"/>
-              </w:rPr>
-              <w:t>saida_leds[11]</w:t>
+            <w:proofErr w:type="spellStart"/>
+            <w:r>
+              <w:rPr>
+                <w:rFonts w:ascii="Arial" w:hAnsi="Arial" w:cs="Arial"/>
+              </w:rPr>
+              <w:t>saida_</w:t>
+            </w:r>
+            <w:proofErr w:type="gramStart"/>
+            <w:r>
+              <w:rPr>
+                <w:rFonts w:ascii="Arial" w:hAnsi="Arial" w:cs="Arial"/>
+              </w:rPr>
+              <w:t>leds</w:t>
+            </w:r>
+            <w:proofErr w:type="spellEnd"/>
+            <w:r>
+              <w:rPr>
+                <w:rFonts w:ascii="Arial" w:hAnsi="Arial" w:cs="Arial"/>
+              </w:rPr>
+              <w:t>[</w:t>
+            </w:r>
+            <w:proofErr w:type="gramEnd"/>
+            <w:r>
+              <w:rPr>
+                <w:rFonts w:ascii="Arial" w:hAnsi="Arial" w:cs="Arial"/>
+              </w:rPr>
+              <w:t>11]</w:t>
             </w:r>
           </w:p>
         </w:tc>
@@ -4182,11 +4865,33 @@
                 <w:rFonts w:ascii="Arial" w:hAnsi="Arial" w:cs="Arial"/>
               </w:rPr>
             </w:pPr>
-            <w:r>
-              <w:rPr>
-                <w:rFonts w:ascii="Arial" w:hAnsi="Arial" w:cs="Arial"/>
-              </w:rPr>
-              <w:t>saida_leds[12]</w:t>
+            <w:proofErr w:type="spellStart"/>
+            <w:r>
+              <w:rPr>
+                <w:rFonts w:ascii="Arial" w:hAnsi="Arial" w:cs="Arial"/>
+              </w:rPr>
+              <w:t>saida_</w:t>
+            </w:r>
+            <w:proofErr w:type="gramStart"/>
+            <w:r>
+              <w:rPr>
+                <w:rFonts w:ascii="Arial" w:hAnsi="Arial" w:cs="Arial"/>
+              </w:rPr>
+              <w:t>leds</w:t>
+            </w:r>
+            <w:proofErr w:type="spellEnd"/>
+            <w:r>
+              <w:rPr>
+                <w:rFonts w:ascii="Arial" w:hAnsi="Arial" w:cs="Arial"/>
+              </w:rPr>
+              <w:t>[</w:t>
+            </w:r>
+            <w:proofErr w:type="gramEnd"/>
+            <w:r>
+              <w:rPr>
+                <w:rFonts w:ascii="Arial" w:hAnsi="Arial" w:cs="Arial"/>
+              </w:rPr>
+              <w:t>12]</w:t>
             </w:r>
           </w:p>
         </w:tc>
@@ -4253,11 +4958,33 @@
                 <w:rFonts w:ascii="Arial" w:hAnsi="Arial" w:cs="Arial"/>
               </w:rPr>
             </w:pPr>
-            <w:r>
-              <w:rPr>
-                <w:rFonts w:ascii="Arial" w:hAnsi="Arial" w:cs="Arial"/>
-              </w:rPr>
-              <w:t>saida_leds[13]</w:t>
+            <w:proofErr w:type="spellStart"/>
+            <w:r>
+              <w:rPr>
+                <w:rFonts w:ascii="Arial" w:hAnsi="Arial" w:cs="Arial"/>
+              </w:rPr>
+              <w:t>saida_</w:t>
+            </w:r>
+            <w:proofErr w:type="gramStart"/>
+            <w:r>
+              <w:rPr>
+                <w:rFonts w:ascii="Arial" w:hAnsi="Arial" w:cs="Arial"/>
+              </w:rPr>
+              <w:t>leds</w:t>
+            </w:r>
+            <w:proofErr w:type="spellEnd"/>
+            <w:r>
+              <w:rPr>
+                <w:rFonts w:ascii="Arial" w:hAnsi="Arial" w:cs="Arial"/>
+              </w:rPr>
+              <w:t>[</w:t>
+            </w:r>
+            <w:proofErr w:type="gramEnd"/>
+            <w:r>
+              <w:rPr>
+                <w:rFonts w:ascii="Arial" w:hAnsi="Arial" w:cs="Arial"/>
+              </w:rPr>
+              <w:t>13]</w:t>
             </w:r>
           </w:p>
         </w:tc>
@@ -4324,11 +5051,33 @@
                 <w:rFonts w:ascii="Arial" w:hAnsi="Arial" w:cs="Arial"/>
               </w:rPr>
             </w:pPr>
-            <w:r>
-              <w:rPr>
-                <w:rFonts w:ascii="Arial" w:hAnsi="Arial" w:cs="Arial"/>
-              </w:rPr>
-              <w:t>saida_leds[14]</w:t>
+            <w:proofErr w:type="spellStart"/>
+            <w:r>
+              <w:rPr>
+                <w:rFonts w:ascii="Arial" w:hAnsi="Arial" w:cs="Arial"/>
+              </w:rPr>
+              <w:t>saida_</w:t>
+            </w:r>
+            <w:proofErr w:type="gramStart"/>
+            <w:r>
+              <w:rPr>
+                <w:rFonts w:ascii="Arial" w:hAnsi="Arial" w:cs="Arial"/>
+              </w:rPr>
+              <w:t>leds</w:t>
+            </w:r>
+            <w:proofErr w:type="spellEnd"/>
+            <w:r>
+              <w:rPr>
+                <w:rFonts w:ascii="Arial" w:hAnsi="Arial" w:cs="Arial"/>
+              </w:rPr>
+              <w:t>[</w:t>
+            </w:r>
+            <w:proofErr w:type="gramEnd"/>
+            <w:r>
+              <w:rPr>
+                <w:rFonts w:ascii="Arial" w:hAnsi="Arial" w:cs="Arial"/>
+              </w:rPr>
+              <w:t>14]</w:t>
             </w:r>
           </w:p>
         </w:tc>
@@ -4395,11 +5144,33 @@
                 <w:rFonts w:ascii="Arial" w:hAnsi="Arial" w:cs="Arial"/>
               </w:rPr>
             </w:pPr>
-            <w:r>
-              <w:rPr>
-                <w:rFonts w:ascii="Arial" w:hAnsi="Arial" w:cs="Arial"/>
-              </w:rPr>
-              <w:t>saida_leds[15]</w:t>
+            <w:proofErr w:type="spellStart"/>
+            <w:r>
+              <w:rPr>
+                <w:rFonts w:ascii="Arial" w:hAnsi="Arial" w:cs="Arial"/>
+              </w:rPr>
+              <w:t>saida_</w:t>
+            </w:r>
+            <w:proofErr w:type="gramStart"/>
+            <w:r>
+              <w:rPr>
+                <w:rFonts w:ascii="Arial" w:hAnsi="Arial" w:cs="Arial"/>
+              </w:rPr>
+              <w:t>leds</w:t>
+            </w:r>
+            <w:proofErr w:type="spellEnd"/>
+            <w:r>
+              <w:rPr>
+                <w:rFonts w:ascii="Arial" w:hAnsi="Arial" w:cs="Arial"/>
+              </w:rPr>
+              <w:t>[</w:t>
+            </w:r>
+            <w:proofErr w:type="gramEnd"/>
+            <w:r>
+              <w:rPr>
+                <w:rFonts w:ascii="Arial" w:hAnsi="Arial" w:cs="Arial"/>
+              </w:rPr>
+              <w:t>15]</w:t>
             </w:r>
           </w:p>
         </w:tc>
@@ -4433,6 +5204,7 @@
           </w:tcPr>
           <w:p>
             <w:pPr>
+              <w:keepNext/>
               <w:spacing w:after="160" w:line="278" w:lineRule="auto"/>
               <w:jc w:val="center"/>
               <w:rPr>
@@ -4451,12 +5223,34 @@
     </w:tbl>
     <w:p>
       <w:pPr>
-        <w:jc w:val="both"/>
-        <w:rPr>
-          <w:rFonts w:ascii="Arial" w:hAnsi="Arial" w:cs="Arial"/>
-        </w:rPr>
-      </w:pPr>
+        <w:pStyle w:val="Legenda"/>
+        <w:jc w:val="center"/>
+      </w:pPr>
+      <w:r>
+        <w:t xml:space="preserve">Tabela </w:t>
+      </w:r>
+      <w:fldSimple w:instr=" SEQ Tabela \* ARABIC ">
+        <w:r>
+          <w:rPr>
+            <w:noProof/>
+          </w:rPr>
+          <w:t>4</w:t>
+        </w:r>
+      </w:fldSimple>
+      <w:r>
+        <w:t xml:space="preserve"> - </w:t>
+      </w:r>
+      <w:r>
+        <w:t xml:space="preserve">Mapeamento da </w:t>
+      </w:r>
+      <w:r>
+        <w:t>saída</w:t>
+      </w:r>
+      <w:r>
+        <w:t xml:space="preserve"> de dados do circuito</w:t>
+      </w:r>
     </w:p>
+    <w:p/>
     <w:p>
       <w:pPr>
         <w:ind w:firstLine="567"/>
@@ -4469,8 +5263,16 @@
         <w:rPr>
           <w:rFonts w:ascii="Arial" w:hAnsi="Arial" w:cs="Arial"/>
         </w:rPr>
-        <w:t>Fora a pinagem de entrada e saída, também está mapeado um pino que representa o sinal de clock</w:t>
-      </w:r>
+        <w:t xml:space="preserve">Fora a pinagem de entrada e saída, também está mapeado um pino que representa o sinal de </w:t>
+      </w:r>
+      <w:proofErr w:type="spellStart"/>
+      <w:r>
+        <w:rPr>
+          <w:rFonts w:ascii="Arial" w:hAnsi="Arial" w:cs="Arial"/>
+        </w:rPr>
+        <w:t>clock</w:t>
+      </w:r>
+      <w:proofErr w:type="spellEnd"/>
       <w:r>
         <w:rPr>
           <w:rFonts w:ascii="Arial" w:hAnsi="Arial" w:cs="Arial"/>
@@ -4603,12 +5405,14 @@
                 <w:rFonts w:ascii="Arial" w:hAnsi="Arial" w:cs="Arial"/>
               </w:rPr>
             </w:pPr>
+            <w:proofErr w:type="spellStart"/>
             <w:r>
               <w:rPr>
                 <w:rFonts w:ascii="Arial" w:hAnsi="Arial" w:cs="Arial"/>
               </w:rPr>
               <w:t>clock</w:t>
             </w:r>
+            <w:proofErr w:type="spellEnd"/>
           </w:p>
         </w:tc>
         <w:tc>
@@ -4647,12 +5451,14 @@
                 <w:rFonts w:ascii="Arial" w:hAnsi="Arial" w:cs="Arial"/>
               </w:rPr>
             </w:pPr>
+            <w:proofErr w:type="spellStart"/>
             <w:r>
               <w:rPr>
                 <w:rFonts w:ascii="Arial" w:hAnsi="Arial" w:cs="Arial"/>
               </w:rPr>
               <w:t>Clock</w:t>
             </w:r>
+            <w:proofErr w:type="spellEnd"/>
           </w:p>
         </w:tc>
       </w:tr>
@@ -4684,27 +5490,7 @@
           <w:sz w:val="28"/>
           <w:szCs w:val="28"/>
         </w:rPr>
-        <w:t>7</w:t>
-      </w:r>
-      <w:r>
-        <w:rPr>
-          <w:rFonts w:ascii="Arial" w:hAnsi="Arial" w:cs="Arial"/>
-          <w:b/>
-          <w:bCs/>
-          <w:sz w:val="28"/>
-          <w:szCs w:val="28"/>
-        </w:rPr>
-        <w:t xml:space="preserve">) </w:t>
-      </w:r>
-      <w:r>
-        <w:rPr>
-          <w:rFonts w:ascii="Arial" w:hAnsi="Arial" w:cs="Arial"/>
-          <w:b/>
-          <w:bCs/>
-          <w:sz w:val="28"/>
-          <w:szCs w:val="28"/>
-        </w:rPr>
-        <w:t>DEPENDÊNCIAS DO AMBIENTE</w:t>
+        <w:t>7) DEPENDÊNCIAS DO AMBIENTE</w:t>
       </w:r>
     </w:p>
     <w:p>
@@ -4738,7 +5524,21 @@
         <w:rPr>
           <w:rFonts w:ascii="Arial" w:hAnsi="Arial" w:cs="Arial"/>
         </w:rPr>
-        <w:t>Vivado 2025.2 (ML Edition)</w:t>
+        <w:t xml:space="preserve">Vivado 2025.2 (ML </w:t>
+      </w:r>
+      <w:proofErr w:type="spellStart"/>
+      <w:r>
+        <w:rPr>
+          <w:rFonts w:ascii="Arial" w:hAnsi="Arial" w:cs="Arial"/>
+        </w:rPr>
+        <w:t>Edition</w:t>
+      </w:r>
+      <w:proofErr w:type="spellEnd"/>
+      <w:r>
+        <w:rPr>
+          <w:rFonts w:ascii="Arial" w:hAnsi="Arial" w:cs="Arial"/>
+        </w:rPr>
+        <w:t>)</w:t>
       </w:r>
     </w:p>
     <w:p>
@@ -5752,6 +6552,7 @@
   <w:style w:type="character" w:default="1" w:styleId="Fontepargpadro">
     <w:name w:val="Default Paragraph Font"/>
     <w:uiPriority w:val="1"/>
+    <w:semiHidden/>
     <w:unhideWhenUsed/>
   </w:style>
   <w:style w:type="table" w:default="1" w:styleId="Tabelanormal">

</xml_diff>